<commit_message>
Update user manuals and fix database seeding for healthcare network documentation
Update user manuals with a real-world referral example and correct the initial seeding data in `server/routes.ts` by removing duplicate entries.

Replit-Commit-Author: Agent
Replit-Commit-Session-Id: ff1ca1cf-8bf7-47f7-8e87-0cee42fb9d05
Replit-Commit-Checkpoint-Type: full_checkpoint
Replit-Commit-Event-Id: 6b630da5-af8c-41de-bb6e-98a1fe7a2f22
Replit-Commit-Screenshot-Url: https://storage.googleapis.com/screenshot-production-us-central1/fc828d39-61cd-41d5-ba8d-20e8af9db227/ff1ca1cf-8bf7-47f7-8e87-0cee42fb9d05/u28Krtz
Replit-Helium-Checkpoint-Created: true
</commit_message>
<xml_diff>
--- a/attached_assets/user-manuals/healthcare_network_documentation_SK.docx
+++ b/attached_assets/user-manuals/healthcare_network_documentation_SK.docx
@@ -2,7 +2,7 @@
 <file path=word/document.xml><?xml version="1.0" encoding="utf-8"?>
 <w:document xmlns:w="http://schemas.openxmlformats.org/wordprocessingml/2006/main" xmlns:m="http://schemas.openxmlformats.org/officeDocument/2006/math" xmlns:r="http://schemas.openxmlformats.org/officeDocument/2006/relationships" xmlns:o="urn:schemas-microsoft-com:office:office" xmlns:v="urn:schemas-microsoft-com:vml" xmlns:w10="urn:schemas-microsoft-com:office:word" xmlns:a="http://schemas.openxmlformats.org/drawingml/2006/main" xmlns:pic="http://schemas.openxmlformats.org/drawingml/2006/picture" xmlns:wp="http://schemas.openxmlformats.org/drawingml/2006/wordprocessingDrawing">
   <w:body>
-    <w:bookmarkStart w:id="68" w:name="indexus-dokumentácia-healthcare-network"/>
+    <w:bookmarkStart w:id="74" w:name="indexus-dokumentácia-healthcare-network"/>
     <w:p>
       <w:pPr>
         <w:pStyle w:val="Heading1"/>
@@ -121,12 +121,12 @@
           <w:numId w:val="1001"/>
         </w:numPr>
       </w:pPr>
-      <w:hyperlink w:anchor="X35031169762537ab1385862641335eff7e55e63">
+      <w:hyperlink w:anchor="Xcc75542009287bbc5195babec8a125dd38e8b40">
         <w:r>
           <w:rPr>
             <w:rStyle w:val="Hyperlink"/>
           </w:rPr>
-          <w:t xml:space="preserve">Systém odporúčaní (Referral)</w:t>
+          <w:t xml:space="preserve">Systém odporúčaní (Referral) — s reálnym príkladom</w:t>
         </w:r>
       </w:hyperlink>
     </w:p>
@@ -452,7 +452,7 @@
               <w:pStyle w:val="Compact"/>
             </w:pPr>
             <w:r>
-              <w:t xml:space="preserve">Okrem primárneho lekára môžu byť ku klinike priradené ďalšie osoby</w:t>
+              <w:t xml:space="preserve">Okrem primárneho lekára môžu byť ku ambulancii priradené ďalšie osoby</w:t>
             </w:r>
           </w:p>
         </w:tc>
@@ -1176,7 +1176,7 @@
               <w:pStyle w:val="Compact"/>
             </w:pPr>
             <w:r>
-              <w:t xml:space="preserve">Zemepisná šírka a dĺžka — možno zadať ručne alebo použiť tlačidlo</w:t>
+              <w:t xml:space="preserve">Zemepisná šírka a dĺžka — zadanie ručne alebo tlačidlo</w:t>
             </w:r>
             <w:r>
               <w:t xml:space="preserve"> </w:t>
@@ -1192,7 +1192,7 @@
               <w:t xml:space="preserve"> </w:t>
             </w:r>
             <w:r>
-              <w:t xml:space="preserve">(využije GPS zariadenia)</w:t>
+              <w:t xml:space="preserve">(GPS zariadenia)</w:t>
             </w:r>
           </w:p>
         </w:tc>
@@ -1248,7 +1248,7 @@
               <w:pStyle w:val="Compact"/>
             </w:pPr>
             <w:r>
-              <w:t xml:space="preserve">Meno interného kontaktu v nemocnici (nie z modulu Osôb)</w:t>
+              <w:t xml:space="preserve">Meno interného kontaktu v nemocnici</w:t>
             </w:r>
           </w:p>
         </w:tc>
@@ -1623,7 +1623,7 @@
         <w:pStyle w:val="FirstParagraph"/>
       </w:pPr>
       <w:r>
-        <w:t xml:space="preserve">Zobrazuje históriu a aktuálny stav všetkých kampaní, do ktorých bola táto nemocnica zaradená. Môžete tu sledovať, ako prebieha kontaktovanie tejto inštitúcie v rámci jednotlivých kampaní.</w:t>
+        <w:t xml:space="preserve">Zobrazuje históriu a aktuálny stav všetkých kampaní, do ktorých bola táto nemocnica zaradená.</w:t>
       </w:r>
     </w:p>
     <w:p>
@@ -2209,7 +2209,7 @@
         <w:t xml:space="preserve"> </w:t>
       </w:r>
       <w:r>
-        <w:t xml:space="preserve">Ambulancia môže mať až 3 telefónne čísla a 3 e-mailové adresy. Priamo pri každom telefónnom čísle je tlačidlo pre okamžité vytočenie cez INDEXUS telefóniu.</w:t>
+        <w:t xml:space="preserve">Ambulancia môže mať až 3 telefónne čísla a 3 e-mailové adresy. Priamo pri každom čísle je tlačidlo pre okamžité vytočenie cez INDEXUS telefóniu.</w:t>
       </w:r>
     </w:p>
     <w:p>
@@ -2541,7 +2541,7 @@
               <w:pStyle w:val="Compact"/>
             </w:pPr>
             <w:r>
-              <w:t xml:space="preserve">Históric vzťahu existuje</w:t>
+              <w:t xml:space="preserve">Historický vzťah existuje</w:t>
             </w:r>
           </w:p>
         </w:tc>
@@ -2855,7 +2855,7 @@
         <w:pStyle w:val="FirstParagraph"/>
       </w:pPr>
       <w:r>
-        <w:t xml:space="preserve">Zobrazuje všetkých pracovníkov priradených k tejto ambulancii — rovnaké zobrazenie ako pri nemocnici. V hornej časti je vyčlenený primárny lekár ambulancie (majiteľ praxe).</w:t>
+        <w:t xml:space="preserve">Zobrazuje všetkých pracovníkov priradených k tejto ambulancii. V hornej časti je vyčlenený primárny lekár ambulancie (majiteľ praxe).</w:t>
       </w:r>
     </w:p>
     <w:p>
@@ -2905,7 +2905,7 @@
         <w:pStyle w:val="FirstParagraph"/>
       </w:pPr>
       <w:r>
-        <w:t xml:space="preserve">Zobrazuje, do akej zdravotníckej siete ambulancia patrí (ak je súčasťou skupiny ambulancií alebo nemocničnej siete).</w:t>
+        <w:t xml:space="preserve">Zobrazuje, do akej zdravotníckej siete ambulancia patrí.</w:t>
       </w:r>
     </w:p>
     <w:p>
@@ -2935,12 +2935,12 @@
       <w:r>
         <w:t xml:space="preserve"> </w:t>
       </w:r>
-      <w:hyperlink w:anchor="X35031169762537ab1385862641335eff7e55e63">
+      <w:hyperlink w:anchor="Xcc75542009287bbc5195babec8a125dd38e8b40">
         <w:r>
           <w:rPr>
             <w:rStyle w:val="Hyperlink"/>
           </w:rPr>
-          <w:t xml:space="preserve">Systém odporúčaní</w:t>
+          <w:t xml:space="preserve">5 — Systém odporúčaní</w:t>
         </w:r>
       </w:hyperlink>
       <w:r>
@@ -2983,7 +2983,7 @@
         <w:t xml:space="preserve">+ Pridať ambulanciu</w:t>
       </w:r>
       <w:r>
-        <w:t xml:space="preserve">. Otvorí sa bočný panel s formulárom. Pri zadávaní mesta systém automaticky navrhne kraj a okres. PSČ je možné dohľadať automaticky cez AI vyhľadávanie (tlačidlo vedľa poľa PSČ).</w:t>
+        <w:t xml:space="preserve">. Pri zadávaní mesta systém automaticky navrhne kraj a okres. PSČ je možné dohľadať automaticky cez AI vyhľadávanie (tlačidlo vedľa poľa PSČ).</w:t>
       </w:r>
     </w:p>
     <w:p>
@@ -3038,7 +3038,7 @@
     </w:p>
     <w:bookmarkEnd w:id="32"/>
     <w:bookmarkEnd w:id="33"/>
-    <w:bookmarkStart w:id="48" w:name="modul-osoby-spolupracovníci-persons"/>
+    <w:bookmarkStart w:id="46" w:name="modul-osoby-spolupracovníci-persons"/>
     <w:p>
       <w:pPr>
         <w:pStyle w:val="Heading2"/>
@@ -3061,7 +3061,7 @@
         <w:pStyle w:val="FirstParagraph"/>
       </w:pPr>
       <w:r>
-        <w:t xml:space="preserve">Modul Osoby (v navigácii nazývaný aj Spolupracovníci) obsahuje všetkých zdravotníckych pracovníkov — lekárov, pôrodné asistentky, sestry a ďalší personál. Každá osoba môže byť priradená k jednej alebo viacerým nemocniciam a ambulanciám. Niektoré osoby sú zároveň aktívnymi spolupracovníkmi s uzavretou zmluvou a dostávajú odmeny.</w:t>
+        <w:t xml:space="preserve">Modul Osoby obsahuje všetkých zdravotníckych pracovníkov — lekárov, pôrodné asistentky, sestry a ďalší personál. Každá osoba môže byť priradená k jednej alebo viacerým nemocniciam a ambulanciám. Niektoré osoby sú zároveň aktívnymi spolupracovníkmi s uzavretou zmluvou a dostávajú odmeny.</w:t>
       </w:r>
     </w:p>
     <w:bookmarkEnd w:id="34"/>
@@ -3338,13 +3338,13 @@
       </w:tr>
     </w:tbl>
     <w:bookmarkEnd w:id="35"/>
-    <w:bookmarkStart w:id="36" w:name="profesijné-klasifikácie-podrobnejšie"/>
+    <w:bookmarkStart w:id="45" w:name="karta-osoby-záložky-wizard"/>
     <w:p>
       <w:pPr>
         <w:pStyle w:val="Heading3"/>
       </w:pPr>
       <w:r>
-        <w:t xml:space="preserve">Profesijné klasifikácie (podrobnejšie)</w:t>
+        <w:t xml:space="preserve">Karta osoby — záložky (Wizard)</w:t>
       </w:r>
     </w:p>
     <w:p>
@@ -3352,97 +3352,7 @@
         <w:pStyle w:val="FirstParagraph"/>
       </w:pPr>
       <w:r>
-        <w:t xml:space="preserve">Pre presnejšiu evidenciu slúži profesijná klasifikácia:</w:t>
-      </w:r>
-      <w:r>
-        <w:t xml:space="preserve"> </w:t>
-      </w:r>
-      <w:r>
-        <w:t xml:space="preserve">- Gynekologickí špecialisti</w:t>
-      </w:r>
-      <w:r>
-        <w:t xml:space="preserve"> </w:t>
-      </w:r>
-      <w:r>
-        <w:t xml:space="preserve">- Praktickí lekári</w:t>
-      </w:r>
-      <w:r>
-        <w:t xml:space="preserve"> </w:t>
-      </w:r>
-      <w:r>
-        <w:t xml:space="preserve">- Primári oddelení</w:t>
-      </w:r>
-      <w:r>
-        <w:t xml:space="preserve"> </w:t>
-      </w:r>
-      <w:r>
-        <w:t xml:space="preserve">- Medicínski riaditelia</w:t>
-      </w:r>
-      <w:r>
-        <w:t xml:space="preserve"> </w:t>
-      </w:r>
-      <w:r>
-        <w:t xml:space="preserve">- Špecializované pôrodné asistentky</w:t>
-      </w:r>
-      <w:r>
-        <w:t xml:space="preserve"> </w:t>
-      </w:r>
-      <w:r>
-        <w:t xml:space="preserve">- Vedúce pôrodné asistentky</w:t>
-      </w:r>
-      <w:r>
-        <w:t xml:space="preserve"> </w:t>
-      </w:r>
-      <w:r>
-        <w:t xml:space="preserve">- Pôrodné asistentky bez špecializácie</w:t>
-      </w:r>
-      <w:r>
-        <w:t xml:space="preserve"> </w:t>
-      </w:r>
-      <w:r>
-        <w:t xml:space="preserve">- Vedúce sestry</w:t>
-      </w:r>
-      <w:r>
-        <w:t xml:space="preserve"> </w:t>
-      </w:r>
-      <w:r>
-        <w:t xml:space="preserve">- Operačné sestry</w:t>
-      </w:r>
-      <w:r>
-        <w:t xml:space="preserve"> </w:t>
-      </w:r>
-      <w:r>
-        <w:t xml:space="preserve">- Všeobecné sestry</w:t>
-      </w:r>
-      <w:r>
-        <w:t xml:space="preserve"> </w:t>
-      </w:r>
-      <w:r>
-        <w:t xml:space="preserve">- Sanitáři a zdravotnícki asistenti</w:t>
-      </w:r>
-      <w:r>
-        <w:t xml:space="preserve"> </w:t>
-      </w:r>
-      <w:r>
-        <w:t xml:space="preserve">- …a ďalšie</w:t>
-      </w:r>
-    </w:p>
-    <w:bookmarkEnd w:id="36"/>
-    <w:bookmarkStart w:id="46" w:name="karta-osoby-záložky-wizard"/>
-    <w:p>
-      <w:pPr>
-        <w:pStyle w:val="Heading3"/>
-      </w:pPr>
-      <w:r>
-        <w:t xml:space="preserve">Karta osoby — záložky (Wizard)</w:t>
-      </w:r>
-    </w:p>
-    <w:p>
-      <w:pPr>
-        <w:pStyle w:val="FirstParagraph"/>
-      </w:pPr>
-      <w:r>
-        <w:t xml:space="preserve">Karta osoby je organizovaná do krokov/záložiek:</w:t>
+        <w:t xml:space="preserve">Karta osoby je organizovaná do 9 krokov/záložiek:</w:t>
       </w:r>
     </w:p>
     <w:p>
@@ -3452,7 +3362,7 @@
         </w:pict>
       </w:r>
     </w:p>
-    <w:bookmarkStart w:id="37" w:name="záložka-1-osobné-údaje"/>
+    <w:bookmarkStart w:id="36" w:name="záložka-1-osobné-údaje"/>
     <w:p>
       <w:pPr>
         <w:pStyle w:val="Heading4"/>
@@ -3539,18 +3449,18 @@
                 <w:b/>
                 <w:bCs/>
               </w:rPr>
-              <w:t xml:space="preserve">Meno</w:t>
-            </w:r>
-          </w:p>
-        </w:tc>
-        <w:tc>
-          <w:tcPr/>
-          <w:p>
-            <w:pPr>
-              <w:pStyle w:val="Compact"/>
-            </w:pPr>
-            <w:r>
-              <w:t xml:space="preserve">Krstné meno</w:t>
+              <w:t xml:space="preserve">Meno / Stredné meno / Priezvisko</w:t>
+            </w:r>
+          </w:p>
+        </w:tc>
+        <w:tc>
+          <w:tcPr/>
+          <w:p>
+            <w:pPr>
+              <w:pStyle w:val="Compact"/>
+            </w:pPr>
+            <w:r>
+              <w:t xml:space="preserve">Celé meno osoby</w:t>
             </w:r>
           </w:p>
         </w:tc>
@@ -3567,18 +3477,18 @@
                 <w:b/>
                 <w:bCs/>
               </w:rPr>
-              <w:t xml:space="preserve">Stredné meno</w:t>
-            </w:r>
-          </w:p>
-        </w:tc>
-        <w:tc>
-          <w:tcPr/>
-          <w:p>
-            <w:pPr>
-              <w:pStyle w:val="Compact"/>
-            </w:pPr>
-            <w:r>
-              <w:t xml:space="preserve">Voliteľné</w:t>
+              <w:t xml:space="preserve">Rodné priezvisko</w:t>
+            </w:r>
+          </w:p>
+        </w:tc>
+        <w:tc>
+          <w:tcPr/>
+          <w:p>
+            <w:pPr>
+              <w:pStyle w:val="Compact"/>
+            </w:pPr>
+            <w:r>
+              <w:t xml:space="preserve">Rodné priezvisko (ak sa líši)</w:t>
             </w:r>
           </w:p>
         </w:tc>
@@ -3595,18 +3505,18 @@
                 <w:b/>
                 <w:bCs/>
               </w:rPr>
-              <w:t xml:space="preserve">Priezvisko</w:t>
-            </w:r>
-          </w:p>
-        </w:tc>
-        <w:tc>
-          <w:tcPr/>
-          <w:p>
-            <w:pPr>
-              <w:pStyle w:val="Compact"/>
-            </w:pPr>
-            <w:r>
-              <w:t xml:space="preserve">Priezvisko</w:t>
+              <w:t xml:space="preserve">Titul za menom</w:t>
+            </w:r>
+          </w:p>
+        </w:tc>
+        <w:tc>
+          <w:tcPr/>
+          <w:p>
+            <w:pPr>
+              <w:pStyle w:val="Compact"/>
+            </w:pPr>
+            <w:r>
+              <w:t xml:space="preserve">Napr. PhD., MPH</w:t>
             </w:r>
           </w:p>
         </w:tc>
@@ -3623,18 +3533,18 @@
                 <w:b/>
                 <w:bCs/>
               </w:rPr>
-              <w:t xml:space="preserve">Rodné priezvisko</w:t>
-            </w:r>
-          </w:p>
-        </w:tc>
-        <w:tc>
-          <w:tcPr/>
-          <w:p>
-            <w:pPr>
-              <w:pStyle w:val="Compact"/>
-            </w:pPr>
-            <w:r>
-              <w:t xml:space="preserve">Rodné priezvisko (ak sa líši)</w:t>
+              <w:t xml:space="preserve">Rodné číslo</w:t>
+            </w:r>
+          </w:p>
+        </w:tc>
+        <w:tc>
+          <w:tcPr/>
+          <w:p>
+            <w:pPr>
+              <w:pStyle w:val="Compact"/>
+            </w:pPr>
+            <w:r>
+              <w:t xml:space="preserve">Pre formálnu identifikáciu</w:t>
             </w:r>
           </w:p>
         </w:tc>
@@ -3651,18 +3561,18 @@
                 <w:b/>
                 <w:bCs/>
               </w:rPr>
-              <w:t xml:space="preserve">Titul za menom</w:t>
-            </w:r>
-          </w:p>
-        </w:tc>
-        <w:tc>
-          <w:tcPr/>
-          <w:p>
-            <w:pPr>
-              <w:pStyle w:val="Compact"/>
-            </w:pPr>
-            <w:r>
-              <w:t xml:space="preserve">Napr. PhD., MPH</w:t>
+              <w:t xml:space="preserve">Dátum a miesto narodenia</w:t>
+            </w:r>
+          </w:p>
+        </w:tc>
+        <w:tc>
+          <w:tcPr/>
+          <w:p>
+            <w:pPr>
+              <w:pStyle w:val="Compact"/>
+            </w:pPr>
+            <w:r>
+              <w:t xml:space="preserve">Deň, mesiac, rok, mesto</w:t>
             </w:r>
           </w:p>
         </w:tc>
@@ -3679,18 +3589,18 @@
                 <w:b/>
                 <w:bCs/>
               </w:rPr>
-              <w:t xml:space="preserve">Rodné číslo</w:t>
-            </w:r>
-          </w:p>
-        </w:tc>
-        <w:tc>
-          <w:tcPr/>
-          <w:p>
-            <w:pPr>
-              <w:pStyle w:val="Compact"/>
-            </w:pPr>
-            <w:r>
-              <w:t xml:space="preserve">Pre formálnu identifikáciu</w:t>
+              <w:t xml:space="preserve">Zdravotná poisťovňa</w:t>
+            </w:r>
+          </w:p>
+        </w:tc>
+        <w:tc>
+          <w:tcPr/>
+          <w:p>
+            <w:pPr>
+              <w:pStyle w:val="Compact"/>
+            </w:pPr>
+            <w:r>
+              <w:t xml:space="preserve">Poisťovňa osoby</w:t>
             </w:r>
           </w:p>
         </w:tc>
@@ -3707,18 +3617,18 @@
                 <w:b/>
                 <w:bCs/>
               </w:rPr>
-              <w:t xml:space="preserve">Dátum narodenia</w:t>
-            </w:r>
-          </w:p>
-        </w:tc>
-        <w:tc>
-          <w:tcPr/>
-          <w:p>
-            <w:pPr>
-              <w:pStyle w:val="Compact"/>
-            </w:pPr>
-            <w:r>
-              <w:t xml:space="preserve">Deň, mesiac, rok</w:t>
+              <w:t xml:space="preserve">Rodinný stav</w:t>
+            </w:r>
+          </w:p>
+        </w:tc>
+        <w:tc>
+          <w:tcPr/>
+          <w:p>
+            <w:pPr>
+              <w:pStyle w:val="Compact"/>
+            </w:pPr>
+            <w:r>
+              <w:t xml:space="preserve">Slobodný/á, Ženatý/Vydatá, Rozvedený/á, Vdovec/Vdova</w:t>
             </w:r>
           </w:p>
         </w:tc>
@@ -3735,90 +3645,6 @@
                 <w:b/>
                 <w:bCs/>
               </w:rPr>
-              <w:t xml:space="preserve">Miesto narodenia</w:t>
-            </w:r>
-          </w:p>
-        </w:tc>
-        <w:tc>
-          <w:tcPr/>
-          <w:p>
-            <w:pPr>
-              <w:pStyle w:val="Compact"/>
-            </w:pPr>
-            <w:r>
-              <w:t xml:space="preserve">Mesto narodenia</w:t>
-            </w:r>
-          </w:p>
-        </w:tc>
-      </w:tr>
-      <w:tr>
-        <w:tc>
-          <w:tcPr/>
-          <w:p>
-            <w:pPr>
-              <w:pStyle w:val="Compact"/>
-            </w:pPr>
-            <w:r>
-              <w:rPr>
-                <w:b/>
-                <w:bCs/>
-              </w:rPr>
-              <w:t xml:space="preserve">Zdravotná poisťovňa</w:t>
-            </w:r>
-          </w:p>
-        </w:tc>
-        <w:tc>
-          <w:tcPr/>
-          <w:p>
-            <w:pPr>
-              <w:pStyle w:val="Compact"/>
-            </w:pPr>
-            <w:r>
-              <w:t xml:space="preserve">Poisťovňa osoby</w:t>
-            </w:r>
-          </w:p>
-        </w:tc>
-      </w:tr>
-      <w:tr>
-        <w:tc>
-          <w:tcPr/>
-          <w:p>
-            <w:pPr>
-              <w:pStyle w:val="Compact"/>
-            </w:pPr>
-            <w:r>
-              <w:rPr>
-                <w:b/>
-                <w:bCs/>
-              </w:rPr>
-              <w:t xml:space="preserve">Rodinný stav</w:t>
-            </w:r>
-          </w:p>
-        </w:tc>
-        <w:tc>
-          <w:tcPr/>
-          <w:p>
-            <w:pPr>
-              <w:pStyle w:val="Compact"/>
-            </w:pPr>
-            <w:r>
-              <w:t xml:space="preserve">Slobodný/á, Ženatý/Vydatá, Rozvedený/á, Vdovec/Vdova</w:t>
-            </w:r>
-          </w:p>
-        </w:tc>
-      </w:tr>
-      <w:tr>
-        <w:tc>
-          <w:tcPr/>
-          <w:p>
-            <w:pPr>
-              <w:pStyle w:val="Compact"/>
-            </w:pPr>
-            <w:r>
-              <w:rPr>
-                <w:b/>
-                <w:bCs/>
-              </w:rPr>
               <w:t xml:space="preserve">Profesijná klasifikácia</w:t>
             </w:r>
           </w:p>
@@ -3830,7 +3656,7 @@
               <w:pStyle w:val="Compact"/>
             </w:pPr>
             <w:r>
-              <w:t xml:space="preserve">Podrobná kategória (viď vyššie)</w:t>
+              <w:t xml:space="preserve">Podrobná kategória zdravotníckeho pracovníka</w:t>
             </w:r>
           </w:p>
         </w:tc>
@@ -4123,8 +3949,8 @@
         </w:pict>
       </w:r>
     </w:p>
-    <w:bookmarkEnd w:id="37"/>
-    <w:bookmarkStart w:id="38" w:name="záložka-2-kontaktné-údaje"/>
+    <w:bookmarkEnd w:id="36"/>
+    <w:bookmarkStart w:id="37" w:name="záložka-2-kontaktné-údaje"/>
     <w:p>
       <w:pPr>
         <w:pStyle w:val="Heading4"/>
@@ -4298,8 +4124,8 @@
         </w:pict>
       </w:r>
     </w:p>
-    <w:bookmarkEnd w:id="38"/>
-    <w:bookmarkStart w:id="39" w:name="záložka-3-bankové-údaje"/>
+    <w:bookmarkEnd w:id="37"/>
+    <w:bookmarkStart w:id="38" w:name="záložka-3-bankové-údaje"/>
     <w:p>
       <w:pPr>
         <w:pStyle w:val="Heading4"/>
@@ -4501,22 +4327,14 @@
         </w:pict>
       </w:r>
     </w:p>
-    <w:bookmarkEnd w:id="39"/>
-    <w:bookmarkStart w:id="40" w:name="záložka-4-zmluvy-a-odmeny"/>
+    <w:bookmarkEnd w:id="38"/>
+    <w:bookmarkStart w:id="39" w:name="záložka-4-zmluvy-a-odmeny"/>
     <w:p>
       <w:pPr>
         <w:pStyle w:val="Heading4"/>
       </w:pPr>
       <w:r>
         <w:t xml:space="preserve">Záložka 4: Zmluvy a odmeny</w:t>
-      </w:r>
-    </w:p>
-    <w:p>
-      <w:pPr>
-        <w:pStyle w:val="FirstParagraph"/>
-      </w:pPr>
-      <w:r>
-        <w:t xml:space="preserve">Evidencia zmluvných vzťahov spolupracovníka.</w:t>
       </w:r>
     </w:p>
     <w:tbl>
@@ -4624,18 +4442,18 @@
                 <w:b/>
                 <w:bCs/>
               </w:rPr>
-              <w:t xml:space="preserve">Forma dohody</w:t>
-            </w:r>
-          </w:p>
-        </w:tc>
-        <w:tc>
-          <w:tcPr/>
-          <w:p>
-            <w:pPr>
-              <w:pStyle w:val="Compact"/>
-            </w:pPr>
-            <w:r>
-              <w:t xml:space="preserve">Právna forma</w:t>
+              <w:t xml:space="preserve">Platnosť od / do</w:t>
+            </w:r>
+          </w:p>
+        </w:tc>
+        <w:tc>
+          <w:tcPr/>
+          <w:p>
+            <w:pPr>
+              <w:pStyle w:val="Compact"/>
+            </w:pPr>
+            <w:r>
+              <w:t xml:space="preserve">Dátumový rozsah platnosti zmluvy</w:t>
             </w:r>
           </w:p>
         </w:tc>
@@ -4652,18 +4470,18 @@
                 <w:b/>
                 <w:bCs/>
               </w:rPr>
-              <w:t xml:space="preserve">Platnosť od / do</w:t>
-            </w:r>
-          </w:p>
-        </w:tc>
-        <w:tc>
-          <w:tcPr/>
-          <w:p>
-            <w:pPr>
-              <w:pStyle w:val="Compact"/>
-            </w:pPr>
-            <w:r>
-              <w:t xml:space="preserve">Dátumový rozsah platnosti zmluvy</w:t>
+              <w:t xml:space="preserve">Zmluva odoslaná / vrátená</w:t>
+            </w:r>
+          </w:p>
+        </w:tc>
+        <w:tc>
+          <w:tcPr/>
+          <w:p>
+            <w:pPr>
+              <w:pStyle w:val="Compact"/>
+            </w:pPr>
+            <w:r>
+              <w:t xml:space="preserve">Sledovanie fyzického obehu zmluvy</w:t>
             </w:r>
           </w:p>
         </w:tc>
@@ -4680,18 +4498,18 @@
                 <w:b/>
                 <w:bCs/>
               </w:rPr>
-              <w:t xml:space="preserve">Zmluva odoslaná / vrátená</w:t>
-            </w:r>
-          </w:p>
-        </w:tc>
-        <w:tc>
-          <w:tcPr/>
-          <w:p>
-            <w:pPr>
-              <w:pStyle w:val="Compact"/>
-            </w:pPr>
-            <w:r>
-              <w:t xml:space="preserve">Sledovanie fyzického obehu zmluvy</w:t>
+              <w:t xml:space="preserve">Registrácia / odhlásenie zo SP</w:t>
+            </w:r>
+          </w:p>
+        </w:tc>
+        <w:tc>
+          <w:tcPr/>
+          <w:p>
+            <w:pPr>
+              <w:pStyle w:val="Compact"/>
+            </w:pPr>
+            <w:r>
+              <w:t xml:space="preserve">Dátumy pre Sociálnu poisťovňu</w:t>
             </w:r>
           </w:p>
         </w:tc>
@@ -4708,18 +4526,18 @@
                 <w:b/>
                 <w:bCs/>
               </w:rPr>
-              <w:t xml:space="preserve">Registrácia do SP</w:t>
-            </w:r>
-          </w:p>
-        </w:tc>
-        <w:tc>
-          <w:tcPr/>
-          <w:p>
-            <w:pPr>
-              <w:pStyle w:val="Compact"/>
-            </w:pPr>
-            <w:r>
-              <w:t xml:space="preserve">Dátum prihlásenia do Sociálnej poisťovne</w:t>
+              <w:t xml:space="preserve">Mesačné odmeny</w:t>
+            </w:r>
+          </w:p>
+        </w:tc>
+        <w:tc>
+          <w:tcPr/>
+          <w:p>
+            <w:pPr>
+              <w:pStyle w:val="Compact"/>
+            </w:pPr>
+            <w:r>
+              <w:t xml:space="preserve">Či dostáva pravidelné mesačné odmeny</w:t>
             </w:r>
           </w:p>
         </w:tc>
@@ -4736,18 +4554,18 @@
                 <w:b/>
                 <w:bCs/>
               </w:rPr>
-              <w:t xml:space="preserve">Odhlásenie zo SP</w:t>
-            </w:r>
-          </w:p>
-        </w:tc>
-        <w:tc>
-          <w:tcPr/>
-          <w:p>
-            <w:pPr>
-              <w:pStyle w:val="Compact"/>
-            </w:pPr>
-            <w:r>
-              <w:t xml:space="preserve">Dátum odhlásenia</w:t>
+              <w:t xml:space="preserve">Typ odmeny</w:t>
+            </w:r>
+          </w:p>
+        </w:tc>
+        <w:tc>
+          <w:tcPr/>
+          <w:p>
+            <w:pPr>
+              <w:pStyle w:val="Compact"/>
+            </w:pPr>
+            <w:r>
+              <w:t xml:space="preserve">Fixná suma alebo percentuálna odmena</w:t>
             </w:r>
           </w:p>
         </w:tc>
@@ -4764,18 +4582,18 @@
                 <w:b/>
                 <w:bCs/>
               </w:rPr>
-              <w:t xml:space="preserve">Mesačné odmeny</w:t>
-            </w:r>
-          </w:p>
-        </w:tc>
-        <w:tc>
-          <w:tcPr/>
-          <w:p>
-            <w:pPr>
-              <w:pStyle w:val="Compact"/>
-            </w:pPr>
-            <w:r>
-              <w:t xml:space="preserve">Či dostáva pravidelné mesačné odmeny</w:t>
+              <w:t xml:space="preserve">Výška fixnej odmeny</w:t>
+            </w:r>
+          </w:p>
+        </w:tc>
+        <w:tc>
+          <w:tcPr/>
+          <w:p>
+            <w:pPr>
+              <w:pStyle w:val="Compact"/>
+            </w:pPr>
+            <w:r>
+              <w:t xml:space="preserve">Suma v príslušnej mene</w:t>
             </w:r>
           </w:p>
         </w:tc>
@@ -4792,62 +4610,6 @@
                 <w:b/>
                 <w:bCs/>
               </w:rPr>
-              <w:t xml:space="preserve">Typ odmeny</w:t>
-            </w:r>
-          </w:p>
-        </w:tc>
-        <w:tc>
-          <w:tcPr/>
-          <w:p>
-            <w:pPr>
-              <w:pStyle w:val="Compact"/>
-            </w:pPr>
-            <w:r>
-              <w:t xml:space="preserve">Fixná suma alebo percentuálna odmena</w:t>
-            </w:r>
-          </w:p>
-        </w:tc>
-      </w:tr>
-      <w:tr>
-        <w:tc>
-          <w:tcPr/>
-          <w:p>
-            <w:pPr>
-              <w:pStyle w:val="Compact"/>
-            </w:pPr>
-            <w:r>
-              <w:rPr>
-                <w:b/>
-                <w:bCs/>
-              </w:rPr>
-              <w:t xml:space="preserve">Výška fixnej odmeny</w:t>
-            </w:r>
-          </w:p>
-        </w:tc>
-        <w:tc>
-          <w:tcPr/>
-          <w:p>
-            <w:pPr>
-              <w:pStyle w:val="Compact"/>
-            </w:pPr>
-            <w:r>
-              <w:t xml:space="preserve">Suma v príslušnej mene</w:t>
-            </w:r>
-          </w:p>
-        </w:tc>
-      </w:tr>
-      <w:tr>
-        <w:tc>
-          <w:tcPr/>
-          <w:p>
-            <w:pPr>
-              <w:pStyle w:val="Compact"/>
-            </w:pPr>
-            <w:r>
-              <w:rPr>
-                <w:b/>
-                <w:bCs/>
-              </w:rPr>
               <w:t xml:space="preserve">Percentuálna odmena</w:t>
             </w:r>
           </w:p>
@@ -4860,34 +4622,6 @@
             </w:pPr>
             <w:r>
               <w:t xml:space="preserve">Podiel z hodnoty podľa krajiny</w:t>
-            </w:r>
-          </w:p>
-        </w:tc>
-      </w:tr>
-      <w:tr>
-        <w:tc>
-          <w:tcPr/>
-          <w:p>
-            <w:pPr>
-              <w:pStyle w:val="Compact"/>
-            </w:pPr>
-            <w:r>
-              <w:rPr>
-                <w:b/>
-                <w:bCs/>
-              </w:rPr>
-              <w:t xml:space="preserve">Poznámka ku zmluve</w:t>
-            </w:r>
-          </w:p>
-        </w:tc>
-        <w:tc>
-          <w:tcPr/>
-          <w:p>
-            <w:pPr>
-              <w:pStyle w:val="Compact"/>
-            </w:pPr>
-            <w:r>
-              <w:t xml:space="preserve">Interné poznámky</w:t>
             </w:r>
           </w:p>
         </w:tc>
@@ -4900,8 +4634,8 @@
         </w:pict>
       </w:r>
     </w:p>
-    <w:bookmarkEnd w:id="40"/>
-    <w:bookmarkStart w:id="41" w:name="záložka-5-dokumenty"/>
+    <w:bookmarkEnd w:id="39"/>
+    <w:bookmarkStart w:id="40" w:name="záložka-5-dokumenty"/>
     <w:p>
       <w:pPr>
         <w:pStyle w:val="Heading4"/>
@@ -4925,8 +4659,8 @@
         </w:pict>
       </w:r>
     </w:p>
-    <w:bookmarkEnd w:id="41"/>
-    <w:bookmarkStart w:id="42" w:name="záložka-6-aktivity-a-akcie"/>
+    <w:bookmarkEnd w:id="40"/>
+    <w:bookmarkStart w:id="41" w:name="záložka-6-aktivity-a-akcie"/>
     <w:p>
       <w:pPr>
         <w:pStyle w:val="Heading4"/>
@@ -4940,7 +4674,7 @@
         <w:pStyle w:val="FirstParagraph"/>
       </w:pPr>
       <w:r>
-        <w:t xml:space="preserve">Prehľad aktivít spolupracovníka — návštevy, hovory, akcie. Zobrazuje sa tu celá história interakcií zaznamenaná k tejto osobe.</w:t>
+        <w:t xml:space="preserve">Prehľad aktivít spolupracovníka — návštevy, hovory, akcie. Celá história interakcií zaznamenaná k tejto osobe.</w:t>
       </w:r>
     </w:p>
     <w:p>
@@ -4950,8 +4684,8 @@
         </w:pict>
       </w:r>
     </w:p>
-    <w:bookmarkEnd w:id="42"/>
-    <w:bookmarkStart w:id="43" w:name="záložka-7-história"/>
+    <w:bookmarkEnd w:id="41"/>
+    <w:bookmarkStart w:id="42" w:name="záložka-7-história"/>
     <w:p>
       <w:pPr>
         <w:pStyle w:val="Heading4"/>
@@ -4975,8 +4709,8 @@
         </w:pict>
       </w:r>
     </w:p>
-    <w:bookmarkEnd w:id="43"/>
-    <w:bookmarkStart w:id="44" w:name="Xd7311845a533f6080eff2d89d11bfb74ee9993e"/>
+    <w:bookmarkEnd w:id="42"/>
+    <w:bookmarkStart w:id="43" w:name="Xd7311845a533f6080eff2d89d11bfb74ee9993e"/>
     <w:p>
       <w:pPr>
         <w:pStyle w:val="Heading4"/>
@@ -5110,7 +4844,7 @@
           <w:i/>
           <w:iCs/>
         </w:rPr>
-        <w:t xml:space="preserve">Pôrodná asistentka</w:t>
+        <w:t xml:space="preserve">Pôrodné asistentky</w:t>
       </w:r>
       <w:r>
         <w:t xml:space="preserve"> </w:t>
@@ -5236,13 +4970,13 @@
           <w:b/>
           <w:bCs/>
         </w:rPr>
-        <w:t xml:space="preserve">Poznámka</w:t>
-      </w:r>
-      <w:r>
-        <w:t xml:space="preserve"> </w:t>
-      </w:r>
-      <w:r>
-        <w:t xml:space="preserve">— voliteľná poznámka ku priradeniu</w:t>
+        <w:t xml:space="preserve">Kto osobu odporučil</w:t>
+      </w:r>
+      <w:r>
+        <w:t xml:space="preserve"> </w:t>
+      </w:r>
+      <w:r>
+        <w:t xml:space="preserve">— fialový štítok s menom odporúčateľa</w:t>
       </w:r>
     </w:p>
     <w:p>
@@ -5286,8 +5020,8 @@
         </w:pict>
       </w:r>
     </w:p>
-    <w:bookmarkEnd w:id="44"/>
-    <w:bookmarkStart w:id="45" w:name="záložka-9-mobilná-aplikácia"/>
+    <w:bookmarkEnd w:id="43"/>
+    <w:bookmarkStart w:id="44" w:name="záložka-9-mobilná-aplikácia"/>
     <w:p>
       <w:pPr>
         <w:pStyle w:val="Heading4"/>
@@ -5311,15 +5045,25 @@
         </w:pict>
       </w:r>
     </w:p>
+    <w:bookmarkEnd w:id="44"/>
     <w:bookmarkEnd w:id="45"/>
     <w:bookmarkEnd w:id="46"/>
-    <w:bookmarkStart w:id="47" w:name="zdroj-leadu-a-odporúčania-pre-osoby"/>
+    <w:bookmarkStart w:id="57" w:name="X973cc7d045a2744b5e0acb7ca6352da619881bb"/>
+    <w:p>
+      <w:pPr>
+        <w:pStyle w:val="Heading2"/>
+      </w:pPr>
+      <w:r>
+        <w:t xml:space="preserve">5. Systém odporúčaní (Referral) — s reálnym príkladom</w:t>
+      </w:r>
+    </w:p>
+    <w:bookmarkStart w:id="47" w:name="prečo-je-referral-kľúčový"/>
     <w:p>
       <w:pPr>
         <w:pStyle w:val="Heading3"/>
       </w:pPr>
       <w:r>
-        <w:t xml:space="preserve">Zdroj leadu a odporúčania pre osoby</w:t>
+        <w:t xml:space="preserve">Prečo je referral kľúčový</w:t>
       </w:r>
     </w:p>
     <w:p>
@@ -5327,73 +5071,7 @@
         <w:pStyle w:val="FirstParagraph"/>
       </w:pPr>
       <w:r>
-        <w:t xml:space="preserve">Rovnako ako pre ambulancie, aj pre osoby sa sleduje:</w:t>
-      </w:r>
-      <w:r>
-        <w:t xml:space="preserve"> </w:t>
-      </w:r>
-      <w:r>
-        <w:t xml:space="preserve">-</w:t>
-      </w:r>
-      <w:r>
-        <w:t xml:space="preserve"> </w:t>
-      </w:r>
-      <w:r>
-        <w:rPr>
-          <w:b/>
-          <w:bCs/>
-        </w:rPr>
-        <w:t xml:space="preserve">Zdroj leadu</w:t>
-      </w:r>
-      <w:r>
-        <w:t xml:space="preserve"> </w:t>
-      </w:r>
-      <w:r>
-        <w:t xml:space="preserve">— ako sa osoba dostala do databázy</w:t>
-      </w:r>
-      <w:r>
-        <w:t xml:space="preserve"> </w:t>
-      </w:r>
-      <w:r>
-        <w:t xml:space="preserve">-</w:t>
-      </w:r>
-      <w:r>
-        <w:t xml:space="preserve"> </w:t>
-      </w:r>
-      <w:r>
-        <w:rPr>
-          <w:b/>
-          <w:bCs/>
-        </w:rPr>
-        <w:t xml:space="preserve">Je odporučený lekárom</w:t>
-      </w:r>
-      <w:r>
-        <w:t xml:space="preserve"> </w:t>
-      </w:r>
-      <w:r>
-        <w:t xml:space="preserve">— prepínač (ak áno, je viditeľné pri osobe v zozname personálu)</w:t>
-      </w:r>
-      <w:r>
-        <w:t xml:space="preserve"> </w:t>
-      </w:r>
-      <w:r>
-        <w:t xml:space="preserve">-</w:t>
-      </w:r>
-      <w:r>
-        <w:t xml:space="preserve"> </w:t>
-      </w:r>
-      <w:r>
-        <w:rPr>
-          <w:b/>
-          <w:bCs/>
-        </w:rPr>
-        <w:t xml:space="preserve">Z konferencie</w:t>
-      </w:r>
-      <w:r>
-        <w:t xml:space="preserve"> </w:t>
-      </w:r>
-      <w:r>
-        <w:t xml:space="preserve">— či bol kontakt nadviazaný na konferencii</w:t>
+        <w:t xml:space="preserve">V cord blood banking je dôvera zásadná. Väčšina nových spolupracovníkov prichádza cez odporúčanie iného lekára alebo pôrodnej asistentky. INDEXUS preto sleduje tieto vzťahy presne — vieme kto koho odporučil, a môžeme cielene rozvíjať sieť odporúčaní.</w:t>
       </w:r>
     </w:p>
     <w:p>
@@ -5404,23 +5082,97 @@
       </w:r>
     </w:p>
     <w:bookmarkEnd w:id="47"/>
+    <w:bookmarkStart w:id="52" w:name="X98f96c9dd3020804d1062c66f3b39923e89686a"/>
+    <w:p>
+      <w:pPr>
+        <w:pStyle w:val="Heading3"/>
+      </w:pPr>
+      <w:r>
+        <w:t xml:space="preserve">Reálny príklad z dát: Referral reťazec — Feráková → Korčok → Trnava</w:t>
+      </w:r>
+    </w:p>
+    <w:p>
+      <w:pPr>
+        <w:pStyle w:val="BlockText"/>
+      </w:pPr>
+      <w:r>
+        <w:rPr>
+          <w:b/>
+          <w:bCs/>
+        </w:rPr>
+        <w:t xml:space="preserve">Toto je skutočný príklad z INDEXUS databázy, zaznamenané 15. 4. 2026. Mená a dátumy sú reálne.</w:t>
+      </w:r>
+    </w:p>
+    <w:bookmarkStart w:id="48" w:name="situácia"/>
+    <w:p>
+      <w:pPr>
+        <w:pStyle w:val="Heading4"/>
+      </w:pPr>
+      <w:r>
+        <w:t xml:space="preserve">Situácia</w:t>
+      </w:r>
+    </w:p>
+    <w:p>
+      <w:pPr>
+        <w:pStyle w:val="FirstParagraph"/>
+      </w:pPr>
+      <w:r>
+        <w:t xml:space="preserve">Obchodný zástupca navštívil</w:t>
+      </w:r>
+      <w:r>
+        <w:t xml:space="preserve"> </w:t>
+      </w:r>
+      <w:r>
+        <w:rPr>
+          <w:b/>
+          <w:bCs/>
+        </w:rPr>
+        <w:t xml:space="preserve">MUDr. Nataša Feráková</w:t>
+      </w:r>
+      <w:r>
+        <w:t xml:space="preserve"> </w:t>
+      </w:r>
+      <w:r>
+        <w:t xml:space="preserve">z</w:t>
+      </w:r>
+      <w:r>
+        <w:t xml:space="preserve"> </w:t>
+      </w:r>
+      <w:r>
+        <w:rPr>
+          <w:i/>
+          <w:iCs/>
+        </w:rPr>
+        <w:t xml:space="preserve">Ambulancie detskej gynekológie</w:t>
+      </w:r>
+      <w:r>
+        <w:t xml:space="preserve"> </w:t>
+      </w:r>
+      <w:r>
+        <w:t xml:space="preserve">v</w:t>
+      </w:r>
+      <w:r>
+        <w:t xml:space="preserve"> </w:t>
+      </w:r>
+      <w:r>
+        <w:rPr>
+          <w:b/>
+          <w:bCs/>
+        </w:rPr>
+        <w:t xml:space="preserve">Novom Meste</w:t>
+      </w:r>
+      <w:r>
+        <w:t xml:space="preserve">. Pani doktorka je dlhoročná spolupracovníčka a pri rozhovore odporučila ďalší kontakt.</w:t>
+      </w:r>
+    </w:p>
     <w:bookmarkEnd w:id="48"/>
-    <w:bookmarkStart w:id="54" w:name="systém-odporúčaní-referral"/>
-    <w:p>
-      <w:pPr>
-        <w:pStyle w:val="Heading2"/>
-      </w:pPr>
-      <w:r>
-        <w:t xml:space="preserve">5. Systém odporúčaní (Referral)</w:t>
-      </w:r>
-    </w:p>
-    <w:bookmarkStart w:id="49" w:name="prečo-je-referral-kľúčový"/>
-    <w:p>
-      <w:pPr>
-        <w:pStyle w:val="Heading3"/>
-      </w:pPr>
-      <w:r>
-        <w:t xml:space="preserve">Prečo je referral kľúčový</w:t>
+    <w:bookmarkStart w:id="49" w:name="Xe4ae7aa15cee9b776a501a3b4f3445258caaff2"/>
+    <w:p>
+      <w:pPr>
+        <w:pStyle w:val="Heading4"/>
+      </w:pPr>
+      <w:r>
+        <w:t xml:space="preserve">Krok 1 — MUDr. Feráková odporučí MUDr. Korčoka</w:t>
       </w:r>
     </w:p>
     <w:p>
@@ -5428,26 +5180,359 @@
         <w:pStyle w:val="FirstParagraph"/>
       </w:pPr>
       <w:r>
-        <w:t xml:space="preserve">V cord blood banking je dôvera zásadná. Väčšina nových spolupracovníkov prichádza cez odporúčanie iného lekára alebo pôrodnej asistentky. INDEXUS preto sleduje tieto vzťahy presne — vieme kto koho odporučil, a môžeme cielene rozvíjať sieť odporúčaní.</w:t>
+        <w:t xml:space="preserve">MUDr. Feráková odporučila oslověniť kolegu</w:t>
+      </w:r>
+      <w:r>
+        <w:t xml:space="preserve"> </w:t>
+      </w:r>
+      <w:r>
+        <w:rPr>
+          <w:b/>
+          <w:bCs/>
+        </w:rPr>
+        <w:t xml:space="preserve">MUDr. Martina Korčoka</w:t>
+      </w:r>
+      <w:r>
+        <w:t xml:space="preserve">, ktorý prevádzkuje ambulanciu</w:t>
+      </w:r>
+      <w:r>
+        <w:t xml:space="preserve"> </w:t>
+      </w:r>
+      <w:r>
+        <w:rPr>
+          <w:i/>
+          <w:iCs/>
+        </w:rPr>
+        <w:t xml:space="preserve">4D Ultrazvuk</w:t>
+      </w:r>
+      <w:r>
+        <w:t xml:space="preserve"> </w:t>
+      </w:r>
+      <w:r>
+        <w:t xml:space="preserve">v</w:t>
+      </w:r>
+      <w:r>
+        <w:t xml:space="preserve"> </w:t>
+      </w:r>
+      <w:r>
+        <w:rPr>
+          <w:b/>
+          <w:bCs/>
+        </w:rPr>
+        <w:t xml:space="preserve">Štúrove</w:t>
+      </w:r>
+      <w:r>
+        <w:t xml:space="preserve">.</w:t>
+      </w:r>
+    </w:p>
+    <w:p>
+      <w:pPr>
+        <w:pStyle w:val="BodyText"/>
+      </w:pPr>
+      <w:r>
+        <w:rPr>
+          <w:b/>
+          <w:bCs/>
+        </w:rPr>
+        <w:t xml:space="preserve">Čo urobíme v INDEXUS:</w:t>
+      </w:r>
+      <w:r>
+        <w:t xml:space="preserve"> </w:t>
+      </w:r>
+      <w:r>
+        <w:t xml:space="preserve">1. Otvorte kartu ambulancie</w:t>
+      </w:r>
+      <w:r>
+        <w:t xml:space="preserve"> </w:t>
+      </w:r>
+      <w:r>
+        <w:rPr>
+          <w:b/>
+          <w:bCs/>
+        </w:rPr>
+        <w:t xml:space="preserve">4D Ultrazvuk</w:t>
+      </w:r>
+      <w:r>
+        <w:t xml:space="preserve"> </w:t>
+      </w:r>
+      <w:r>
+        <w:t xml:space="preserve">(Štúrovo)</w:t>
+      </w:r>
+      <w:r>
+        <w:t xml:space="preserve"> </w:t>
+      </w:r>
+      <w:r>
+        <w:t xml:space="preserve">2. V záložke</w:t>
+      </w:r>
+      <w:r>
+        <w:t xml:space="preserve"> </w:t>
+      </w:r>
+      <w:r>
+        <w:rPr>
+          <w:b/>
+          <w:bCs/>
+        </w:rPr>
+        <w:t xml:space="preserve">Pipeline</w:t>
+      </w:r>
+      <w:r>
+        <w:t xml:space="preserve"> </w:t>
+      </w:r>
+      <w:r>
+        <w:t xml:space="preserve">nastavte:</w:t>
+      </w:r>
+      <w:r>
+        <w:t xml:space="preserve"> </w:t>
+      </w:r>
+      <w:r>
+        <w:t xml:space="preserve">- Zdroj leadu =</w:t>
+      </w:r>
+      <w:r>
+        <w:t xml:space="preserve"> </w:t>
+      </w:r>
+      <w:r>
+        <w:rPr>
+          <w:b/>
+          <w:bCs/>
+        </w:rPr>
+        <w:t xml:space="preserve">Odporúčanie lekára</w:t>
+      </w:r>
+      <w:r>
+        <w:t xml:space="preserve"> </w:t>
+      </w:r>
+      <w:r>
+        <w:t xml:space="preserve">- Zaškrtnite prepínač</w:t>
+      </w:r>
+      <w:r>
+        <w:t xml:space="preserve"> </w:t>
+      </w:r>
+      <w:r>
+        <w:rPr>
+          <w:b/>
+          <w:bCs/>
+        </w:rPr>
+        <w:t xml:space="preserve">Je odporučená lekárom</w:t>
+      </w:r>
+      <w:r>
+        <w:t xml:space="preserve"> </w:t>
+      </w:r>
+      <w:r>
+        <w:t xml:space="preserve">3. V záložke</w:t>
+      </w:r>
+      <w:r>
+        <w:t xml:space="preserve"> </w:t>
+      </w:r>
+      <w:r>
+        <w:rPr>
+          <w:b/>
+          <w:bCs/>
+        </w:rPr>
+        <w:t xml:space="preserve">Odporúčania</w:t>
+      </w:r>
+      <w:r>
+        <w:t xml:space="preserve"> </w:t>
+      </w:r>
+      <w:r>
+        <w:t xml:space="preserve">pridajte prepojenie na</w:t>
+      </w:r>
+      <w:r>
+        <w:t xml:space="preserve"> </w:t>
+      </w:r>
+      <w:r>
+        <w:rPr>
+          <w:i/>
+          <w:iCs/>
+        </w:rPr>
+        <w:t xml:space="preserve">Ambulanciu detskej gynekológie</w:t>
+      </w:r>
+      <w:r>
+        <w:t xml:space="preserve"> </w:t>
+      </w:r>
+      <w:r>
+        <w:t xml:space="preserve">(MUDr. Feráková, Nové Mesto)</w:t>
+      </w:r>
+    </w:p>
+    <w:p>
+      <w:pPr>
+        <w:pStyle w:val="BodyText"/>
+      </w:pPr>
+      <w:r>
+        <w:rPr>
+          <w:b/>
+          <w:bCs/>
+        </w:rPr>
+        <w:t xml:space="preserve">Výsledok v systéme:</w:t>
+      </w:r>
+    </w:p>
+    <w:p>
+      <w:pPr>
+        <w:pStyle w:val="SourceCode"/>
+      </w:pPr>
+      <w:r>
+        <w:rPr>
+          <w:rStyle w:val="VerbatimChar"/>
+        </w:rPr>
+        <w:t xml:space="preserve">4D Ultrazvuk — MUDr. Martin Korčok, Štúrovo</w:t>
+      </w:r>
+      <w:r>
+        <w:br/>
+      </w:r>
+      <w:r>
+        <w:rPr>
+          <w:rStyle w:val="VerbatimChar"/>
+        </w:rPr>
+        <w:t xml:space="preserve">  └─ [Odporúčanie] ← Ambulancia detskej gynekológie — MUDr. Nataša Feráková, Nové Mesto</w:t>
+      </w:r>
+      <w:r>
+        <w:br/>
+      </w:r>
+      <w:r>
+        <w:rPr>
+          <w:rStyle w:val="VerbatimChar"/>
+        </w:rPr>
+        <w:t xml:space="preserve">       Typ: Odporúčanie lekára  |  Zaznamenané: 15.4.2026</w:t>
       </w:r>
     </w:p>
     <w:bookmarkEnd w:id="49"/>
-    <w:bookmarkStart w:id="52" w:name="ako-referral-funguje"/>
-    <w:p>
-      <w:pPr>
-        <w:pStyle w:val="Heading3"/>
-      </w:pPr>
-      <w:r>
-        <w:t xml:space="preserve">Ako referral funguje</w:t>
-      </w:r>
-    </w:p>
-    <w:bookmarkStart w:id="50" w:name="pre-ambulancie"/>
+    <w:bookmarkStart w:id="50" w:name="X1dc8915ab7f4a97e552a450785b8b8406d096ed"/>
     <w:p>
       <w:pPr>
         <w:pStyle w:val="Heading4"/>
       </w:pPr>
       <w:r>
-        <w:t xml:space="preserve">Pre ambulancie</w:t>
+        <w:t xml:space="preserve">Krok 2 — MUDr. Korčok odporučí ďalšiu ambulanciu</w:t>
+      </w:r>
+    </w:p>
+    <w:p>
+      <w:pPr>
+        <w:pStyle w:val="FirstParagraph"/>
+      </w:pPr>
+      <w:r>
+        <w:t xml:space="preserve">Po úspešnom nadviazaní spolupráce s MUDr. Korčokom on sám odporučil ďalšiu ambulanciu —</w:t>
+      </w:r>
+      <w:r>
+        <w:t xml:space="preserve"> </w:t>
+      </w:r>
+      <w:r>
+        <w:rPr>
+          <w:b/>
+          <w:bCs/>
+        </w:rPr>
+        <w:t xml:space="preserve">Gynekologicko-pôrodnícku ambulanciu</w:t>
+      </w:r>
+      <w:r>
+        <w:t xml:space="preserve"> </w:t>
+      </w:r>
+      <w:r>
+        <w:t xml:space="preserve">v</w:t>
+      </w:r>
+      <w:r>
+        <w:t xml:space="preserve"> </w:t>
+      </w:r>
+      <w:r>
+        <w:rPr>
+          <w:b/>
+          <w:bCs/>
+        </w:rPr>
+        <w:t xml:space="preserve">Trnave</w:t>
+      </w:r>
+      <w:r>
+        <w:t xml:space="preserve">.</w:t>
+      </w:r>
+    </w:p>
+    <w:p>
+      <w:pPr>
+        <w:pStyle w:val="BodyText"/>
+      </w:pPr>
+      <w:r>
+        <w:rPr>
+          <w:b/>
+          <w:bCs/>
+        </w:rPr>
+        <w:t xml:space="preserve">Finálny referral reťazec v INDEXUS:</w:t>
+      </w:r>
+    </w:p>
+    <w:p>
+      <w:pPr>
+        <w:pStyle w:val="SourceCode"/>
+      </w:pPr>
+      <w:r>
+        <w:rPr>
+          <w:rStyle w:val="VerbatimChar"/>
+        </w:rPr>
+        <w:t xml:space="preserve">MUDr. Nataša Feráková</w:t>
+      </w:r>
+      <w:r>
+        <w:br/>
+      </w:r>
+      <w:r>
+        <w:rPr>
+          <w:rStyle w:val="VerbatimChar"/>
+        </w:rPr>
+        <w:t xml:space="preserve">Ambulancia detskej gynekológie, Nové Mesto</w:t>
+      </w:r>
+      <w:r>
+        <w:br/>
+      </w:r>
+      <w:r>
+        <w:rPr>
+          <w:rStyle w:val="VerbatimChar"/>
+        </w:rPr>
+        <w:t xml:space="preserve">        │</w:t>
+      </w:r>
+      <w:r>
+        <w:br/>
+      </w:r>
+      <w:r>
+        <w:rPr>
+          <w:rStyle w:val="VerbatimChar"/>
+        </w:rPr>
+        <w:t xml:space="preserve">        └──► MUDr. Martin Korčok</w:t>
+      </w:r>
+      <w:r>
+        <w:br/>
+      </w:r>
+      <w:r>
+        <w:rPr>
+          <w:rStyle w:val="VerbatimChar"/>
+        </w:rPr>
+        <w:t xml:space="preserve">             4D Ultrazvuk, Štúrovo               [15.4.2026]</w:t>
+      </w:r>
+      <w:r>
+        <w:br/>
+      </w:r>
+      <w:r>
+        <w:rPr>
+          <w:rStyle w:val="VerbatimChar"/>
+        </w:rPr>
+        <w:t xml:space="preserve">                     │</w:t>
+      </w:r>
+      <w:r>
+        <w:br/>
+      </w:r>
+      <w:r>
+        <w:rPr>
+          <w:rStyle w:val="VerbatimChar"/>
+        </w:rPr>
+        <w:t xml:space="preserve">                     └──► Gynekologicko-pôrodnícka ambulancia</w:t>
+      </w:r>
+      <w:r>
+        <w:br/>
+      </w:r>
+      <w:r>
+        <w:rPr>
+          <w:rStyle w:val="VerbatimChar"/>
+        </w:rPr>
+        <w:t xml:space="preserve">                          Trnava                 [15.4.2026]</w:t>
+      </w:r>
+    </w:p>
+    <w:bookmarkEnd w:id="50"/>
+    <w:bookmarkStart w:id="51" w:name="čo-táto-viditeľnosť-dáva-manažérovi"/>
+    <w:p>
+      <w:pPr>
+        <w:pStyle w:val="Heading4"/>
+      </w:pPr>
+      <w:r>
+        <w:t xml:space="preserve">Čo táto viditeľnosť dáva manažérovi</w:t>
       </w:r>
     </w:p>
     <w:p>
@@ -5459,33 +5544,17 @@
         </w:numPr>
       </w:pPr>
       <w:r>
-        <w:t xml:space="preserve">Pri zadaní ambulancie vyberiete</w:t>
-      </w:r>
-      <w:r>
-        <w:t xml:space="preserve"> </w:t>
-      </w:r>
-      <w:r>
-        <w:rPr>
-          <w:b/>
-          <w:bCs/>
-        </w:rPr>
-        <w:t xml:space="preserve">Zdroj leadu</w:t>
-      </w:r>
-      <w:r>
-        <w:t xml:space="preserve"> </w:t>
-      </w:r>
-      <w:r>
-        <w:t xml:space="preserve">=</w:t>
-      </w:r>
-      <w:r>
-        <w:t xml:space="preserve"> </w:t>
-      </w:r>
-      <w:r>
-        <w:rPr>
-          <w:i/>
-          <w:iCs/>
-        </w:rPr>
-        <w:t xml:space="preserve">Odporúčanie lekára</w:t>
+        <w:rPr>
+          <w:b/>
+          <w:bCs/>
+        </w:rPr>
+        <w:t xml:space="preserve">MUDr. Feráková je kľúčový odporúčateľ</w:t>
+      </w:r>
+      <w:r>
+        <w:t xml:space="preserve"> </w:t>
+      </w:r>
+      <w:r>
+        <w:t xml:space="preserve">— cez jednu návštevu vznikli 2 nové ambulancie v sieti</w:t>
       </w:r>
     </w:p>
     <w:p>
@@ -5497,17 +5566,14 @@
         </w:numPr>
       </w:pPr>
       <w:r>
-        <w:t xml:space="preserve">Zaškrtnete prepínač</w:t>
-      </w:r>
-      <w:r>
-        <w:t xml:space="preserve"> </w:t>
-      </w:r>
-      <w:r>
-        <w:rPr>
-          <w:b/>
-          <w:bCs/>
-        </w:rPr>
-        <w:t xml:space="preserve">Je odporučená lekárom</w:t>
+        <w:rPr>
+          <w:b/>
+          <w:bCs/>
+        </w:rPr>
+        <w:t xml:space="preserve">Odborná dôvera sa prenáša</w:t>
+      </w:r>
+      <w:r>
+        <w:t xml:space="preserve">: Korčok dôveruje Ferákovej, Trnava dôveruje Korčokovi</w:t>
       </w:r>
     </w:p>
     <w:p>
@@ -5519,97 +5585,106 @@
         </w:numPr>
       </w:pPr>
       <w:r>
-        <w:t xml:space="preserve">V záložke</w:t>
-      </w:r>
-      <w:r>
-        <w:t xml:space="preserve"> </w:t>
-      </w:r>
-      <w:r>
-        <w:rPr>
-          <w:b/>
-          <w:bCs/>
-        </w:rPr>
-        <w:t xml:space="preserve">Odporúčania</w:t>
-      </w:r>
-      <w:r>
-        <w:t xml:space="preserve"> </w:t>
-      </w:r>
-      <w:r>
-        <w:t xml:space="preserve">sa zobrazí odkaz na odporúčajúceho lekára</w:t>
-      </w:r>
-    </w:p>
-    <w:p>
-      <w:pPr>
-        <w:pStyle w:val="FirstParagraph"/>
-      </w:pPr>
-      <w:r>
-        <w:t xml:space="preserve">Systém sleduje:</w:t>
-      </w:r>
-      <w:r>
-        <w:t xml:space="preserve"> </w:t>
-      </w:r>
-      <w:r>
-        <w:t xml:space="preserve">- Kto odporučil túto ambulanciu</w:t>
-      </w:r>
-      <w:r>
-        <w:t xml:space="preserve"> </w:t>
-      </w:r>
-      <w:r>
-        <w:t xml:space="preserve">- Ktoré iné ambulancie táto ambulancia odporučila</w:t>
-      </w:r>
-    </w:p>
-    <w:bookmarkEnd w:id="50"/>
-    <w:bookmarkStart w:id="51" w:name="pre-osoby-personál-inštitúcie"/>
+        <w:t xml:space="preserve">Pri plánovaní</w:t>
+      </w:r>
+      <w:r>
+        <w:t xml:space="preserve"> </w:t>
+      </w:r>
+      <w:r>
+        <w:rPr>
+          <w:b/>
+          <w:bCs/>
+        </w:rPr>
+        <w:t xml:space="preserve">odmien za odporúčania</w:t>
+      </w:r>
+      <w:r>
+        <w:t xml:space="preserve"> </w:t>
+      </w:r>
+      <w:r>
+        <w:t xml:space="preserve">je celý reťazec jasne zdokumentovaný a auditovateľný</w:t>
+      </w:r>
+    </w:p>
+    <w:p>
+      <w:pPr>
+        <w:pStyle w:val="Compact"/>
+        <w:numPr>
+          <w:ilvl w:val="0"/>
+          <w:numId w:val="1004"/>
+        </w:numPr>
+      </w:pPr>
+      <w:r>
+        <w:t xml:space="preserve">Môžete cielene</w:t>
+      </w:r>
+      <w:r>
+        <w:t xml:space="preserve"> </w:t>
+      </w:r>
+      <w:r>
+        <w:rPr>
+          <w:b/>
+          <w:bCs/>
+        </w:rPr>
+        <w:t xml:space="preserve">rozvíjať spoluprácu s Feráková</w:t>
+      </w:r>
+      <w:r>
+        <w:t xml:space="preserve"> </w:t>
+      </w:r>
+      <w:r>
+        <w:t xml:space="preserve">— vie odporučiť ďalšie kontakty</w:t>
+      </w:r>
+    </w:p>
+    <w:p>
+      <w:r>
+        <w:pict>
+          <v:rect style="width:0;height:1.5pt" o:hralign="center" o:hrstd="t" o:hr="t"/>
+        </w:pict>
+      </w:r>
+    </w:p>
+    <w:bookmarkEnd w:id="51"/>
+    <w:bookmarkEnd w:id="52"/>
+    <w:bookmarkStart w:id="55" w:name="ako-referral-funguje-všeobecne"/>
+    <w:p>
+      <w:pPr>
+        <w:pStyle w:val="Heading3"/>
+      </w:pPr>
+      <w:r>
+        <w:t xml:space="preserve">Ako referral funguje všeobecne</w:t>
+      </w:r>
+    </w:p>
+    <w:bookmarkStart w:id="53" w:name="pre-ambulancie"/>
     <w:p>
       <w:pPr>
         <w:pStyle w:val="Heading4"/>
       </w:pPr>
       <w:r>
-        <w:t xml:space="preserve">Pre osoby (personál inštitúcie)</w:t>
-      </w:r>
-    </w:p>
-    <w:p>
-      <w:pPr>
-        <w:pStyle w:val="FirstParagraph"/>
-      </w:pPr>
-      <w:r>
-        <w:t xml:space="preserve">Pri priradení osoby k nemocnici alebo ambulancii cez záložku Personál môžete vyplniť:</w:t>
-      </w:r>
-      <w:r>
-        <w:t xml:space="preserve"> </w:t>
-      </w:r>
-      <w:r>
-        <w:t xml:space="preserve">-</w:t>
-      </w:r>
-      <w:r>
-        <w:t xml:space="preserve"> </w:t>
-      </w:r>
-      <w:r>
-        <w:rPr>
-          <w:b/>
-          <w:bCs/>
-        </w:rPr>
-        <w:t xml:space="preserve">Odporučil/a</w:t>
-      </w:r>
-      <w:r>
-        <w:t xml:space="preserve"> </w:t>
-      </w:r>
-      <w:r>
-        <w:t xml:space="preserve">— vyberte meno osoby, ktorá tohto pracovníka odporučila</w:t>
-      </w:r>
-    </w:p>
-    <w:p>
-      <w:pPr>
-        <w:pStyle w:val="BodyText"/>
-      </w:pPr>
-      <w:r>
-        <w:t xml:space="preserve">Po uložení sa pri mene pracovníka v zozname personálu zobrazí fialový štítok:</w:t>
-      </w:r>
-      <w:r>
-        <w:t xml:space="preserve"> </w:t>
-      </w:r>
-      <w:r>
-        <w:t xml:space="preserve">&gt;</w:t>
+        <w:t xml:space="preserve">Pre ambulancie</w:t>
+      </w:r>
+    </w:p>
+    <w:p>
+      <w:pPr>
+        <w:pStyle w:val="Compact"/>
+        <w:numPr>
+          <w:ilvl w:val="0"/>
+          <w:numId w:val="1005"/>
+        </w:numPr>
+      </w:pPr>
+      <w:r>
+        <w:t xml:space="preserve">Pri zadaní ambulancie vyberiete</w:t>
+      </w:r>
+      <w:r>
+        <w:t xml:space="preserve"> </w:t>
+      </w:r>
+      <w:r>
+        <w:rPr>
+          <w:b/>
+          <w:bCs/>
+        </w:rPr>
+        <w:t xml:space="preserve">Zdroj leadu</w:t>
+      </w:r>
+      <w:r>
+        <w:t xml:space="preserve"> </w:t>
+      </w:r>
+      <w:r>
+        <w:t xml:space="preserve">=</w:t>
       </w:r>
       <w:r>
         <w:t xml:space="preserve"> </w:t>
@@ -5619,13 +5694,113 @@
           <w:i/>
           <w:iCs/>
         </w:rPr>
-        <w:t xml:space="preserve">“Odporučil Ján Novák”</w:t>
-      </w:r>
-      <w:r>
-        <w:t xml:space="preserve"> </w:t>
-      </w:r>
-      <w:r>
-        <w:t xml:space="preserve">(pre muža)</w:t>
+        <w:t xml:space="preserve">Odporúčanie lekára</w:t>
+      </w:r>
+    </w:p>
+    <w:p>
+      <w:pPr>
+        <w:pStyle w:val="Compact"/>
+        <w:numPr>
+          <w:ilvl w:val="0"/>
+          <w:numId w:val="1005"/>
+        </w:numPr>
+      </w:pPr>
+      <w:r>
+        <w:t xml:space="preserve">Zaškrtnete prepínač</w:t>
+      </w:r>
+      <w:r>
+        <w:t xml:space="preserve"> </w:t>
+      </w:r>
+      <w:r>
+        <w:rPr>
+          <w:b/>
+          <w:bCs/>
+        </w:rPr>
+        <w:t xml:space="preserve">Je odporučená lekárom</w:t>
+      </w:r>
+    </w:p>
+    <w:p>
+      <w:pPr>
+        <w:pStyle w:val="Compact"/>
+        <w:numPr>
+          <w:ilvl w:val="0"/>
+          <w:numId w:val="1005"/>
+        </w:numPr>
+      </w:pPr>
+      <w:r>
+        <w:t xml:space="preserve">V záložke</w:t>
+      </w:r>
+      <w:r>
+        <w:t xml:space="preserve"> </w:t>
+      </w:r>
+      <w:r>
+        <w:rPr>
+          <w:b/>
+          <w:bCs/>
+        </w:rPr>
+        <w:t xml:space="preserve">Odporúčania</w:t>
+      </w:r>
+      <w:r>
+        <w:t xml:space="preserve"> </w:t>
+      </w:r>
+      <w:r>
+        <w:t xml:space="preserve">sa zobrazí odkaz na odporúčajúceho lekára</w:t>
+      </w:r>
+    </w:p>
+    <w:p>
+      <w:pPr>
+        <w:pStyle w:val="FirstParagraph"/>
+      </w:pPr>
+      <w:r>
+        <w:t xml:space="preserve">Systém sleduje obojstranne — kto odporučil túto ambulanciu a ktoré ďalšie ambulancie táto ambulancia odporučila.</w:t>
+      </w:r>
+    </w:p>
+    <w:bookmarkEnd w:id="53"/>
+    <w:bookmarkStart w:id="54" w:name="pre-osoby-personál-inštitúcie"/>
+    <w:p>
+      <w:pPr>
+        <w:pStyle w:val="Heading4"/>
+      </w:pPr>
+      <w:r>
+        <w:t xml:space="preserve">Pre osoby (personál inštitúcie)</w:t>
+      </w:r>
+    </w:p>
+    <w:p>
+      <w:pPr>
+        <w:pStyle w:val="FirstParagraph"/>
+      </w:pPr>
+      <w:r>
+        <w:t xml:space="preserve">Pri priradení osoby k nemocnici alebo ambulancii cez záložku Personál môžete vyplniť:</w:t>
+      </w:r>
+      <w:r>
+        <w:t xml:space="preserve"> </w:t>
+      </w:r>
+      <w:r>
+        <w:t xml:space="preserve">-</w:t>
+      </w:r>
+      <w:r>
+        <w:t xml:space="preserve"> </w:t>
+      </w:r>
+      <w:r>
+        <w:rPr>
+          <w:b/>
+          <w:bCs/>
+        </w:rPr>
+        <w:t xml:space="preserve">Odporučil/a</w:t>
+      </w:r>
+      <w:r>
+        <w:t xml:space="preserve"> </w:t>
+      </w:r>
+      <w:r>
+        <w:t xml:space="preserve">— vyberte meno osoby, ktorá tohto pracovníka odporučila</w:t>
+      </w:r>
+    </w:p>
+    <w:p>
+      <w:pPr>
+        <w:pStyle w:val="BodyText"/>
+      </w:pPr>
+      <w:r>
+        <w:t xml:space="preserve">Po uložení sa pri mene pracovníka v zozname personálu zobrazí fialový štítok:</w:t>
       </w:r>
       <w:r>
         <w:t xml:space="preserve"> </w:t>
@@ -5641,24 +5816,48 @@
           <w:i/>
           <w:iCs/>
         </w:rPr>
+        <w:t xml:space="preserve">“Odporučil Ján Novák”</w:t>
+      </w:r>
+      <w:r>
+        <w:t xml:space="preserve"> </w:t>
+      </w:r>
+      <w:r>
+        <w:t xml:space="preserve">(pre muža) /</w:t>
+      </w:r>
+      <w:r>
+        <w:t xml:space="preserve"> </w:t>
+      </w:r>
+      <w:r>
+        <w:rPr>
+          <w:i/>
+          <w:iCs/>
+        </w:rPr>
         <w:t xml:space="preserve">“Odporučila Jana Nováková”</w:t>
       </w:r>
       <w:r>
         <w:t xml:space="preserve"> </w:t>
       </w:r>
       <w:r>
-        <w:t xml:space="preserve">(pre ženu — INDEXUS rozpozná pohlavie podľa priezviska)</w:t>
-      </w:r>
-    </w:p>
-    <w:bookmarkEnd w:id="51"/>
-    <w:bookmarkEnd w:id="52"/>
-    <w:bookmarkStart w:id="53" w:name="X0a96918a84ece3fa868f5c25da42c310c456f8f"/>
+        <w:t xml:space="preserve">(pre ženu)</w:t>
+      </w:r>
+    </w:p>
+    <w:p>
+      <w:pPr>
+        <w:pStyle w:val="BodyText"/>
+      </w:pPr>
+      <w:r>
+        <w:t xml:space="preserve">INDEXUS automaticky rozpozná pohlavie podľa koncovky priezviska (napr. -ová = žena).</w:t>
+      </w:r>
+    </w:p>
+    <w:bookmarkEnd w:id="54"/>
+    <w:bookmarkEnd w:id="55"/>
+    <w:bookmarkStart w:id="56" w:name="X6dbc664d74c3b3b5e0986023f87034227b7039e"/>
     <w:p>
       <w:pPr>
         <w:pStyle w:val="Heading3"/>
       </w:pPr>
       <w:r>
-        <w:t xml:space="preserve">Ako udržiavať referral aktuálny — odporúčané postupy</w:t>
+        <w:t xml:space="preserve">Odporúčané postupy pre udržiavanie referral siete</w:t>
       </w:r>
     </w:p>
     <w:tbl>
@@ -5707,18 +5906,18 @@
               <w:pStyle w:val="Compact"/>
             </w:pPr>
             <w:r>
-              <w:t xml:space="preserve">Lekár odporučil nového kolegu</w:t>
-            </w:r>
-          </w:p>
-        </w:tc>
-        <w:tc>
-          <w:tcPr/>
-          <w:p>
-            <w:pPr>
-              <w:pStyle w:val="Compact"/>
-            </w:pPr>
-            <w:r>
-              <w:t xml:space="preserve">Pri vytváraní osoby nastaviť Zdroj leadu =</w:t>
+              <w:t xml:space="preserve">Lekár odporučil novú ambulanciu</w:t>
+            </w:r>
+          </w:p>
+        </w:tc>
+        <w:tc>
+          <w:tcPr/>
+          <w:p>
+            <w:pPr>
+              <w:pStyle w:val="Compact"/>
+            </w:pPr>
+            <w:r>
+              <w:t xml:space="preserve">Nastaviť Zdroj leadu =</w:t>
             </w:r>
             <w:r>
               <w:t xml:space="preserve"> </w:t>
@@ -5731,34 +5930,31 @@
               <w:t xml:space="preserve">Odporúčanie lekára</w:t>
             </w:r>
             <w:r>
-              <w:t xml:space="preserve"> </w:t>
-            </w:r>
-            <w:r>
-              <w:t xml:space="preserve">a zaznamenať meno odporúčateľa v priradení k inštitúcii</w:t>
-            </w:r>
-          </w:p>
-        </w:tc>
-      </w:tr>
-      <w:tr>
-        <w:tc>
-          <w:tcPr/>
-          <w:p>
-            <w:pPr>
-              <w:pStyle w:val="Compact"/>
-            </w:pPr>
-            <w:r>
-              <w:t xml:space="preserve">Pôrodná asistentka odporučila ambulanciu</w:t>
-            </w:r>
-          </w:p>
-        </w:tc>
-        <w:tc>
-          <w:tcPr/>
-          <w:p>
-            <w:pPr>
-              <w:pStyle w:val="Compact"/>
-            </w:pPr>
-            <w:r>
-              <w:t xml:space="preserve">Pri ambulancii nastaviť Zdroj leadu =</w:t>
+              <w:t xml:space="preserve">, prepojiť cez záložku Odporúčania</w:t>
+            </w:r>
+          </w:p>
+        </w:tc>
+      </w:tr>
+      <w:tr>
+        <w:tc>
+          <w:tcPr/>
+          <w:p>
+            <w:pPr>
+              <w:pStyle w:val="Compact"/>
+            </w:pPr>
+            <w:r>
+              <w:t xml:space="preserve">Pôrodná asistentka odporučila kolegu</w:t>
+            </w:r>
+          </w:p>
+        </w:tc>
+        <w:tc>
+          <w:tcPr/>
+          <w:p>
+            <w:pPr>
+              <w:pStyle w:val="Compact"/>
+            </w:pPr>
+            <w:r>
+              <w:t xml:space="preserve">Pri novom pracovníkovi vyplniť pole</w:t>
             </w:r>
             <w:r>
               <w:t xml:space="preserve"> </w:t>
@@ -5768,13 +5964,13 @@
                 <w:i/>
                 <w:iCs/>
               </w:rPr>
-              <w:t xml:space="preserve">Odporúčanie lekára</w:t>
+              <w:t xml:space="preserve">Odporučil/a</w:t>
             </w:r>
             <w:r>
               <w:t xml:space="preserve"> </w:t>
             </w:r>
             <w:r>
-              <w:t xml:space="preserve">a v záložke Odporúčania prepojiť s odporúčajúcou osobou</w:t>
+              <w:t xml:space="preserve">pri priradení k inštitúcii</w:t>
             </w:r>
           </w:p>
         </w:tc>
@@ -5814,7 +6010,7 @@
               <w:t xml:space="preserve"> </w:t>
             </w:r>
             <w:r>
-              <w:t xml:space="preserve">— umožní merať produktivitu existujúcich spolupracovníkov</w:t>
+              <w:t xml:space="preserve">— meranie produktivity existujúcich spolupracovníkov</w:t>
             </w:r>
           </w:p>
         </w:tc>
@@ -5872,7 +6068,7 @@
         <w:t xml:space="preserve"> </w:t>
       </w:r>
       <w:r>
-        <w:t xml:space="preserve">Na základe zdrojov leadov možno merať, ktoré kanály prinášajú najviac spolupracovníkov a nastaviť priority oslovovania. Správne vyplnená referral história je tiež základom pre odmeny za odporúčania.</w:t>
+        <w:t xml:space="preserve">Na základe zdrojov leadov možno merať, ktoré kanály prinášajú najviac spolupracovníkov. Správne vyplnená referral história je tiež základom pre odmeny za odporúčania.</w:t>
       </w:r>
     </w:p>
     <w:p>
@@ -5882,9 +6078,9 @@
         </w:pict>
       </w:r>
     </w:p>
-    <w:bookmarkEnd w:id="53"/>
-    <w:bookmarkEnd w:id="54"/>
-    <w:bookmarkStart w:id="57" w:name="práca-s-personálom-inštitúcie"/>
+    <w:bookmarkEnd w:id="56"/>
+    <w:bookmarkEnd w:id="57"/>
+    <w:bookmarkStart w:id="63" w:name="práca-s-personálom-inštitúcie"/>
     <w:p>
       <w:pPr>
         <w:pStyle w:val="Heading2"/>
@@ -5893,7 +6089,7 @@
         <w:t xml:space="preserve">6. Práca s personálom inštitúcie</w:t>
       </w:r>
     </w:p>
-    <w:bookmarkStart w:id="55" w:name="Xb13cf9749e337782bc7e610efb35a2e731a3349"/>
+    <w:bookmarkStart w:id="58" w:name="Xb13cf9749e337782bc7e610efb35a2e731a3349"/>
     <w:p>
       <w:pPr>
         <w:pStyle w:val="Heading3"/>
@@ -5907,7 +6103,7 @@
         <w:pStyle w:val="Compact"/>
         <w:numPr>
           <w:ilvl w:val="0"/>
-          <w:numId w:val="1005"/>
+          <w:numId w:val="1006"/>
         </w:numPr>
       </w:pPr>
       <w:r>
@@ -5945,7 +6141,7 @@
         <w:pStyle w:val="Compact"/>
         <w:numPr>
           <w:ilvl w:val="0"/>
-          <w:numId w:val="1005"/>
+          <w:numId w:val="1006"/>
         </w:numPr>
       </w:pPr>
       <w:r>
@@ -5967,7 +6163,7 @@
         <w:pStyle w:val="Compact"/>
         <w:numPr>
           <w:ilvl w:val="0"/>
-          <w:numId w:val="1005"/>
+          <w:numId w:val="1006"/>
         </w:numPr>
       </w:pPr>
       <w:r>
@@ -5989,7 +6185,7 @@
         <w:pStyle w:val="Compact"/>
         <w:numPr>
           <w:ilvl w:val="0"/>
-          <w:numId w:val="1005"/>
+          <w:numId w:val="1006"/>
         </w:numPr>
       </w:pPr>
       <w:r>
@@ -6001,7 +6197,7 @@
         <w:pStyle w:val="Compact"/>
         <w:numPr>
           <w:ilvl w:val="0"/>
-          <w:numId w:val="1005"/>
+          <w:numId w:val="1006"/>
         </w:numPr>
       </w:pPr>
       <w:r>
@@ -6013,7 +6209,7 @@
         <w:pStyle w:val="Compact"/>
         <w:numPr>
           <w:ilvl w:val="1"/>
-          <w:numId w:val="1006"/>
+          <w:numId w:val="1007"/>
         </w:numPr>
       </w:pPr>
       <w:r>
@@ -6045,7 +6241,7 @@
         <w:pStyle w:val="Compact"/>
         <w:numPr>
           <w:ilvl w:val="1"/>
-          <w:numId w:val="1006"/>
+          <w:numId w:val="1007"/>
         </w:numPr>
       </w:pPr>
       <w:r>
@@ -6069,7 +6265,7 @@
           <w:i/>
           <w:iCs/>
         </w:rPr>
-        <w:t xml:space="preserve">Pôrodná asistentka</w:t>
+        <w:t xml:space="preserve">Pôrodné asistentky</w:t>
       </w:r>
     </w:p>
     <w:p>
@@ -6077,7 +6273,7 @@
         <w:pStyle w:val="Compact"/>
         <w:numPr>
           <w:ilvl w:val="1"/>
-          <w:numId w:val="1006"/>
+          <w:numId w:val="1007"/>
         </w:numPr>
       </w:pPr>
       <w:r>
@@ -6099,7 +6295,7 @@
         <w:pStyle w:val="Compact"/>
         <w:numPr>
           <w:ilvl w:val="1"/>
-          <w:numId w:val="1006"/>
+          <w:numId w:val="1007"/>
         </w:numPr>
       </w:pPr>
       <w:r>
@@ -6121,7 +6317,7 @@
         <w:pStyle w:val="Compact"/>
         <w:numPr>
           <w:ilvl w:val="1"/>
-          <w:numId w:val="1006"/>
+          <w:numId w:val="1007"/>
         </w:numPr>
       </w:pPr>
       <w:r>
@@ -6143,7 +6339,7 @@
         <w:pStyle w:val="Compact"/>
         <w:numPr>
           <w:ilvl w:val="1"/>
-          <w:numId w:val="1006"/>
+          <w:numId w:val="1007"/>
         </w:numPr>
       </w:pPr>
       <w:r>
@@ -6165,21 +6361,21 @@
         <w:pStyle w:val="Compact"/>
         <w:numPr>
           <w:ilvl w:val="0"/>
-          <w:numId w:val="1005"/>
+          <w:numId w:val="1006"/>
         </w:numPr>
       </w:pPr>
       <w:r>
         <w:t xml:space="preserve">Uložte</w:t>
       </w:r>
     </w:p>
-    <w:bookmarkEnd w:id="55"/>
-    <w:bookmarkStart w:id="56" w:name="kategorické-zaradenie-personálu"/>
+    <w:bookmarkEnd w:id="58"/>
+    <w:bookmarkStart w:id="62" w:name="aktuálny-zoznam-mpn-pozícií"/>
     <w:p>
       <w:pPr>
         <w:pStyle w:val="Heading3"/>
       </w:pPr>
       <w:r>
-        <w:t xml:space="preserve">Kategorické zaradenie personálu</w:t>
+        <w:t xml:space="preserve">Aktuálny zoznam MPN pozícií</w:t>
       </w:r>
     </w:p>
     <w:p>
@@ -6203,177 +6399,608 @@
         <w:t xml:space="preserve"> </w:t>
       </w:r>
       <w:r>
-        <w:t xml:space="preserve">pre presné zaradenie personálu. Kategórie platia pre nemocnice aj ambulancie a sú rozdelené podľa rozsahu:</w:t>
-      </w:r>
-    </w:p>
-    <w:p>
-      <w:pPr>
-        <w:pStyle w:val="BodyText"/>
-      </w:pPr>
-      <w:r>
-        <w:rPr>
-          <w:b/>
-          <w:bCs/>
-        </w:rPr>
-        <w:t xml:space="preserve">Kategórie pre nemocnice:</w:t>
-      </w:r>
-      <w:r>
-        <w:t xml:space="preserve"> </w:t>
-      </w:r>
-      <w:r>
-        <w:t xml:space="preserve">- Riaditeľ nemocnice (Hospital Director)</w:t>
-      </w:r>
-      <w:r>
-        <w:t xml:space="preserve"> </w:t>
-      </w:r>
-      <w:r>
-        <w:t xml:space="preserve">- Vedúci oddelenia (Department Head)</w:t>
-      </w:r>
-      <w:r>
-        <w:t xml:space="preserve"> </w:t>
-      </w:r>
-      <w:r>
-        <w:t xml:space="preserve">- Primár (Chief Physician)</w:t>
-      </w:r>
-      <w:r>
-        <w:t xml:space="preserve"> </w:t>
-      </w:r>
-      <w:r>
-        <w:t xml:space="preserve">- Sekundár (Attending Physician)</w:t>
-      </w:r>
-      <w:r>
-        <w:t xml:space="preserve"> </w:t>
-      </w:r>
-      <w:r>
-        <w:t xml:space="preserve">- Gynekológ (Gynecologist)</w:t>
-      </w:r>
-      <w:r>
-        <w:t xml:space="preserve"> </w:t>
-      </w:r>
-      <w:r>
-        <w:t xml:space="preserve">- Pôrodník (Obstetrician)</w:t>
-      </w:r>
-      <w:r>
-        <w:t xml:space="preserve"> </w:t>
-      </w:r>
-      <w:r>
-        <w:t xml:space="preserve">- Neonatológ (Neonatologist)</w:t>
-      </w:r>
-      <w:r>
-        <w:t xml:space="preserve"> </w:t>
-      </w:r>
-      <w:r>
-        <w:t xml:space="preserve">- Pediater (Pediatrician)</w:t>
-      </w:r>
-      <w:r>
-        <w:t xml:space="preserve"> </w:t>
-      </w:r>
-      <w:r>
-        <w:t xml:space="preserve">- Vedúca sestra (Head Nurse)</w:t>
-      </w:r>
-      <w:r>
-        <w:t xml:space="preserve"> </w:t>
-      </w:r>
-      <w:r>
-        <w:t xml:space="preserve">- Sestra (Nurse)</w:t>
-      </w:r>
-      <w:r>
-        <w:t xml:space="preserve"> </w:t>
-      </w:r>
-      <w:r>
-        <w:t xml:space="preserve">- Pôrodná asistentka pri pôrode (Delivery Midwife)</w:t>
-      </w:r>
-      <w:r>
-        <w:t xml:space="preserve"> </w:t>
-      </w:r>
-      <w:r>
-        <w:t xml:space="preserve">- Pôrodná asistentka (Midwife)</w:t>
-      </w:r>
-      <w:r>
-        <w:t xml:space="preserve"> </w:t>
-      </w:r>
-      <w:r>
-        <w:t xml:space="preserve">- Anestéziológ, Chirurg, Hematológ, Onkológ…</w:t>
-      </w:r>
-    </w:p>
-    <w:p>
-      <w:pPr>
-        <w:pStyle w:val="BodyText"/>
-      </w:pPr>
-      <w:r>
-        <w:rPr>
-          <w:b/>
-          <w:bCs/>
-        </w:rPr>
-        <w:t xml:space="preserve">Kategórie pre ambulancie:</w:t>
-      </w:r>
-      <w:r>
-        <w:t xml:space="preserve"> </w:t>
-      </w:r>
-      <w:r>
-        <w:t xml:space="preserve">- Ambulantný gynekológ (Ambulatory Gynecologist)</w:t>
-      </w:r>
-      <w:r>
-        <w:t xml:space="preserve"> </w:t>
-      </w:r>
-      <w:r>
-        <w:t xml:space="preserve">- Praktický lekár (General Practitioner)</w:t>
-      </w:r>
-      <w:r>
-        <w:t xml:space="preserve"> </w:t>
-      </w:r>
-      <w:r>
-        <w:t xml:space="preserve">- KOL (Key Opinion Leader) — lekári s výrazným vplyvom v oblasti</w:t>
-      </w:r>
-      <w:r>
-        <w:t xml:space="preserve"> </w:t>
-      </w:r>
-      <w:r>
-        <w:t xml:space="preserve">- Strategický partner (Strategic Partner)</w:t>
-      </w:r>
-      <w:r>
-        <w:t xml:space="preserve"> </w:t>
-      </w:r>
-      <w:r>
-        <w:t xml:space="preserve">- Zdroj odporúčaní (Referral Source)</w:t>
-      </w:r>
-    </w:p>
-    <w:p>
-      <w:pPr>
-        <w:pStyle w:val="BodyText"/>
-      </w:pPr>
-      <w:r>
-        <w:rPr>
-          <w:b/>
-          <w:bCs/>
-        </w:rPr>
-        <w:t xml:space="preserve">Špeciálne kategórie:</w:t>
-      </w:r>
-      <w:r>
-        <w:t xml:space="preserve"> </w:t>
-      </w:r>
-      <w:r>
-        <w:t xml:space="preserve">- Prenatal Instructor (lektor predpôrodných kurzov)</w:t>
-      </w:r>
-      <w:r>
-        <w:t xml:space="preserve"> </w:t>
-      </w:r>
-      <w:r>
-        <w:t xml:space="preserve">- Doula</w:t>
-      </w:r>
-      <w:r>
-        <w:t xml:space="preserve"> </w:t>
-      </w:r>
-      <w:r>
-        <w:t xml:space="preserve">- Konzultant laktácie (Lactation Consultant)</w:t>
-      </w:r>
-      <w:r>
-        <w:t xml:space="preserve"> </w:t>
-      </w:r>
-      <w:r>
-        <w:t xml:space="preserve">- Lekárnik (Pharmacist)</w:t>
-      </w:r>
-    </w:p>
+        <w:t xml:space="preserve">pre presné zaradenie personálu.</w:t>
+      </w:r>
+    </w:p>
+    <w:bookmarkStart w:id="59" w:name="kategórie-pre-nemocnice"/>
+    <w:p>
+      <w:pPr>
+        <w:pStyle w:val="Heading4"/>
+      </w:pPr>
+      <w:r>
+        <w:t xml:space="preserve">Kategórie pre nemocnice</w:t>
+      </w:r>
+    </w:p>
+    <w:tbl>
+      <w:tblPr>
+        <w:tblStyle w:val="Table"/>
+        <w:tblW w:type="pct" w:w="5000"/>
+        <w:tblLayout w:type="fixed"/>
+        <w:tblLook w:firstRow="1" w:lastRow="0" w:firstColumn="0" w:lastColumn="0" w:noHBand="0" w:noVBand="0" w:val="0020"/>
+      </w:tblPr>
+      <w:tblGrid>
+        <w:gridCol w:w="1070"/>
+        <w:gridCol w:w="3424"/>
+        <w:gridCol w:w="3424"/>
+      </w:tblGrid>
+      <w:tr>
+        <w:trPr>
+          <w:tblHeader w:val="on"/>
+        </w:trPr>
+        <w:tc>
+          <w:tcPr/>
+          <w:p>
+            <w:pPr>
+              <w:pStyle w:val="Compact"/>
+            </w:pPr>
+            <w:r>
+              <w:t xml:space="preserve">Kód</w:t>
+            </w:r>
+          </w:p>
+        </w:tc>
+        <w:tc>
+          <w:tcPr/>
+          <w:p>
+            <w:pPr>
+              <w:pStyle w:val="Compact"/>
+            </w:pPr>
+            <w:r>
+              <w:t xml:space="preserve">Slovenský názov</w:t>
+            </w:r>
+          </w:p>
+        </w:tc>
+        <w:tc>
+          <w:tcPr/>
+          <w:p>
+            <w:pPr>
+              <w:pStyle w:val="Compact"/>
+            </w:pPr>
+            <w:r>
+              <w:t xml:space="preserve">Anglický názov</w:t>
+            </w:r>
+          </w:p>
+        </w:tc>
+      </w:tr>
+      <w:tr>
+        <w:tc>
+          <w:tcPr/>
+          <w:p>
+            <w:pPr>
+              <w:pStyle w:val="Compact"/>
+            </w:pPr>
+            <w:r>
+              <w:rPr>
+                <w:rStyle w:val="VerbatimChar"/>
+              </w:rPr>
+              <w:t xml:space="preserve">hospital_director</w:t>
+            </w:r>
+          </w:p>
+        </w:tc>
+        <w:tc>
+          <w:tcPr/>
+          <w:p>
+            <w:pPr>
+              <w:pStyle w:val="Compact"/>
+            </w:pPr>
+            <w:r>
+              <w:t xml:space="preserve">Riaditeľ nemocnice</w:t>
+            </w:r>
+          </w:p>
+        </w:tc>
+        <w:tc>
+          <w:tcPr/>
+          <w:p>
+            <w:pPr>
+              <w:pStyle w:val="Compact"/>
+            </w:pPr>
+            <w:r>
+              <w:t xml:space="preserve">Hospital Director</w:t>
+            </w:r>
+          </w:p>
+        </w:tc>
+      </w:tr>
+      <w:tr>
+        <w:tc>
+          <w:tcPr/>
+          <w:p>
+            <w:pPr>
+              <w:pStyle w:val="Compact"/>
+            </w:pPr>
+            <w:r>
+              <w:rPr>
+                <w:rStyle w:val="VerbatimChar"/>
+              </w:rPr>
+              <w:t xml:space="preserve">department_head</w:t>
+            </w:r>
+          </w:p>
+        </w:tc>
+        <w:tc>
+          <w:tcPr/>
+          <w:p>
+            <w:pPr>
+              <w:pStyle w:val="Compact"/>
+            </w:pPr>
+            <w:r>
+              <w:t xml:space="preserve">Vedúci pôrodníckeho oddelenia</w:t>
+            </w:r>
+          </w:p>
+        </w:tc>
+        <w:tc>
+          <w:tcPr/>
+          <w:p>
+            <w:pPr>
+              <w:pStyle w:val="Compact"/>
+            </w:pPr>
+            <w:r>
+              <w:t xml:space="preserve">Head of Obstetrics Department</w:t>
+            </w:r>
+          </w:p>
+        </w:tc>
+      </w:tr>
+      <w:tr>
+        <w:tc>
+          <w:tcPr/>
+          <w:p>
+            <w:pPr>
+              <w:pStyle w:val="Compact"/>
+            </w:pPr>
+            <w:r>
+              <w:rPr>
+                <w:rStyle w:val="VerbatimChar"/>
+              </w:rPr>
+              <w:t xml:space="preserve">head_nurse</w:t>
+            </w:r>
+          </w:p>
+        </w:tc>
+        <w:tc>
+          <w:tcPr/>
+          <w:p>
+            <w:pPr>
+              <w:pStyle w:val="Compact"/>
+            </w:pPr>
+            <w:r>
+              <w:t xml:space="preserve">Hlavná/vrchná sestra pôrodníckeho oddelenia</w:t>
+            </w:r>
+          </w:p>
+        </w:tc>
+        <w:tc>
+          <w:tcPr/>
+          <w:p>
+            <w:pPr>
+              <w:pStyle w:val="Compact"/>
+            </w:pPr>
+            <w:r>
+              <w:t xml:space="preserve">Head Nurse of Obstetrics Department</w:t>
+            </w:r>
+          </w:p>
+        </w:tc>
+      </w:tr>
+      <w:tr>
+        <w:tc>
+          <w:tcPr/>
+          <w:p>
+            <w:pPr>
+              <w:pStyle w:val="Compact"/>
+            </w:pPr>
+            <w:r>
+              <w:rPr>
+                <w:rStyle w:val="VerbatimChar"/>
+              </w:rPr>
+              <w:t xml:space="preserve">delivery_midwife</w:t>
+            </w:r>
+          </w:p>
+        </w:tc>
+        <w:tc>
+          <w:tcPr/>
+          <w:p>
+            <w:pPr>
+              <w:pStyle w:val="Compact"/>
+            </w:pPr>
+            <w:r>
+              <w:t xml:space="preserve">Pôrodné asistentky/hebamme</w:t>
+            </w:r>
+          </w:p>
+        </w:tc>
+        <w:tc>
+          <w:tcPr/>
+          <w:p>
+            <w:pPr>
+              <w:pStyle w:val="Compact"/>
+            </w:pPr>
+            <w:r>
+              <w:t xml:space="preserve">Delivery Midwives</w:t>
+            </w:r>
+          </w:p>
+        </w:tc>
+      </w:tr>
+      <w:tr>
+        <w:tc>
+          <w:tcPr/>
+          <w:p>
+            <w:pPr>
+              <w:pStyle w:val="Compact"/>
+            </w:pPr>
+            <w:r>
+              <w:rPr>
+                <w:rStyle w:val="VerbatimChar"/>
+              </w:rPr>
+              <w:t xml:space="preserve">department_doctor</w:t>
+            </w:r>
+          </w:p>
+        </w:tc>
+        <w:tc>
+          <w:tcPr/>
+          <w:p>
+            <w:pPr>
+              <w:pStyle w:val="Compact"/>
+            </w:pPr>
+            <w:r>
+              <w:t xml:space="preserve">Lekári pôrodníckeho oddelenia</w:t>
+            </w:r>
+          </w:p>
+        </w:tc>
+        <w:tc>
+          <w:tcPr/>
+          <w:p>
+            <w:pPr>
+              <w:pStyle w:val="Compact"/>
+            </w:pPr>
+            <w:r>
+              <w:t xml:space="preserve">Obstetrics Department Doctors</w:t>
+            </w:r>
+          </w:p>
+        </w:tc>
+      </w:tr>
+      <w:tr>
+        <w:tc>
+          <w:tcPr/>
+          <w:p>
+            <w:pPr>
+              <w:pStyle w:val="Compact"/>
+            </w:pPr>
+            <w:r>
+              <w:rPr>
+                <w:rStyle w:val="VerbatimChar"/>
+              </w:rPr>
+              <w:t xml:space="preserve">department_nurse</w:t>
+            </w:r>
+          </w:p>
+        </w:tc>
+        <w:tc>
+          <w:tcPr/>
+          <w:p>
+            <w:pPr>
+              <w:pStyle w:val="Compact"/>
+            </w:pPr>
+            <w:r>
+              <w:t xml:space="preserve">Sestry pôrodníckeho oddelenia</w:t>
+            </w:r>
+          </w:p>
+        </w:tc>
+        <w:tc>
+          <w:tcPr/>
+          <w:p>
+            <w:pPr>
+              <w:pStyle w:val="Compact"/>
+            </w:pPr>
+            <w:r>
+              <w:t xml:space="preserve">Obstetrics Department Nurses</w:t>
+            </w:r>
+          </w:p>
+        </w:tc>
+      </w:tr>
+    </w:tbl>
+    <w:bookmarkEnd w:id="59"/>
+    <w:bookmarkStart w:id="60" w:name="kategórie-pre-ambulancie"/>
+    <w:p>
+      <w:pPr>
+        <w:pStyle w:val="Heading4"/>
+      </w:pPr>
+      <w:r>
+        <w:t xml:space="preserve">Kategórie pre ambulancie</w:t>
+      </w:r>
+    </w:p>
+    <w:tbl>
+      <w:tblPr>
+        <w:tblStyle w:val="Table"/>
+        <w:tblW w:type="auto" w:w="0"/>
+        <w:tblLook w:firstRow="1" w:lastRow="0" w:firstColumn="0" w:lastColumn="0" w:noHBand="0" w:noVBand="0" w:val="0020"/>
+      </w:tblPr>
+      <w:tblGrid>
+        <w:gridCol w:w="2640"/>
+        <w:gridCol w:w="2640"/>
+        <w:gridCol w:w="2640"/>
+      </w:tblGrid>
+      <w:tr>
+        <w:trPr>
+          <w:tblHeader w:val="on"/>
+        </w:trPr>
+        <w:tc>
+          <w:tcPr/>
+          <w:p>
+            <w:pPr>
+              <w:pStyle w:val="Compact"/>
+            </w:pPr>
+            <w:r>
+              <w:t xml:space="preserve">Kód</w:t>
+            </w:r>
+          </w:p>
+        </w:tc>
+        <w:tc>
+          <w:tcPr/>
+          <w:p>
+            <w:pPr>
+              <w:pStyle w:val="Compact"/>
+            </w:pPr>
+            <w:r>
+              <w:t xml:space="preserve">Slovenský názov</w:t>
+            </w:r>
+          </w:p>
+        </w:tc>
+        <w:tc>
+          <w:tcPr/>
+          <w:p>
+            <w:pPr>
+              <w:pStyle w:val="Compact"/>
+            </w:pPr>
+            <w:r>
+              <w:t xml:space="preserve">Anglický názov</w:t>
+            </w:r>
+          </w:p>
+        </w:tc>
+      </w:tr>
+      <w:tr>
+        <w:tc>
+          <w:tcPr/>
+          <w:p>
+            <w:pPr>
+              <w:pStyle w:val="Compact"/>
+            </w:pPr>
+            <w:r>
+              <w:rPr>
+                <w:rStyle w:val="VerbatimChar"/>
+              </w:rPr>
+              <w:t xml:space="preserve">gynecologist_private</w:t>
+            </w:r>
+          </w:p>
+        </w:tc>
+        <w:tc>
+          <w:tcPr/>
+          <w:p>
+            <w:pPr>
+              <w:pStyle w:val="Compact"/>
+            </w:pPr>
+            <w:r>
+              <w:t xml:space="preserve">Súkromný gynekológ</w:t>
+            </w:r>
+          </w:p>
+        </w:tc>
+        <w:tc>
+          <w:tcPr/>
+          <w:p>
+            <w:pPr>
+              <w:pStyle w:val="Compact"/>
+            </w:pPr>
+            <w:r>
+              <w:t xml:space="preserve">Private Gynecologist</w:t>
+            </w:r>
+          </w:p>
+        </w:tc>
+      </w:tr>
+      <w:tr>
+        <w:tc>
+          <w:tcPr/>
+          <w:p>
+            <w:pPr>
+              <w:pStyle w:val="Compact"/>
+            </w:pPr>
+            <w:r>
+              <w:rPr>
+                <w:rStyle w:val="VerbatimChar"/>
+              </w:rPr>
+              <w:t xml:space="preserve">pediatrician_private</w:t>
+            </w:r>
+          </w:p>
+        </w:tc>
+        <w:tc>
+          <w:tcPr/>
+          <w:p>
+            <w:pPr>
+              <w:pStyle w:val="Compact"/>
+            </w:pPr>
+            <w:r>
+              <w:t xml:space="preserve">Súkromný pediater</w:t>
+            </w:r>
+          </w:p>
+        </w:tc>
+        <w:tc>
+          <w:tcPr/>
+          <w:p>
+            <w:pPr>
+              <w:pStyle w:val="Compact"/>
+            </w:pPr>
+            <w:r>
+              <w:t xml:space="preserve">Private Pediatrician</w:t>
+            </w:r>
+          </w:p>
+        </w:tc>
+      </w:tr>
+    </w:tbl>
+    <w:bookmarkEnd w:id="60"/>
+    <w:bookmarkStart w:id="61" w:name="kategórie-pre-nezávislých-pracovníkov"/>
+    <w:p>
+      <w:pPr>
+        <w:pStyle w:val="Heading4"/>
+      </w:pPr>
+      <w:r>
+        <w:t xml:space="preserve">Kategórie pre nezávislých pracovníkov</w:t>
+      </w:r>
+    </w:p>
+    <w:tbl>
+      <w:tblPr>
+        <w:tblStyle w:val="Table"/>
+        <w:tblW w:type="pct" w:w="5000"/>
+        <w:tblLayout w:type="fixed"/>
+        <w:tblLook w:firstRow="1" w:lastRow="0" w:firstColumn="0" w:lastColumn="0" w:noHBand="0" w:noVBand="0" w:val="0020"/>
+      </w:tblPr>
+      <w:tblGrid>
+        <w:gridCol w:w="1070"/>
+        <w:gridCol w:w="3424"/>
+        <w:gridCol w:w="3424"/>
+      </w:tblGrid>
+      <w:tr>
+        <w:trPr>
+          <w:tblHeader w:val="on"/>
+        </w:trPr>
+        <w:tc>
+          <w:tcPr/>
+          <w:p>
+            <w:pPr>
+              <w:pStyle w:val="Compact"/>
+            </w:pPr>
+            <w:r>
+              <w:t xml:space="preserve">Kód</w:t>
+            </w:r>
+          </w:p>
+        </w:tc>
+        <w:tc>
+          <w:tcPr/>
+          <w:p>
+            <w:pPr>
+              <w:pStyle w:val="Compact"/>
+            </w:pPr>
+            <w:r>
+              <w:t xml:space="preserve">Slovenský názov</w:t>
+            </w:r>
+          </w:p>
+        </w:tc>
+        <w:tc>
+          <w:tcPr/>
+          <w:p>
+            <w:pPr>
+              <w:pStyle w:val="Compact"/>
+            </w:pPr>
+            <w:r>
+              <w:t xml:space="preserve">Anglický názov</w:t>
+            </w:r>
+          </w:p>
+        </w:tc>
+      </w:tr>
+      <w:tr>
+        <w:tc>
+          <w:tcPr/>
+          <w:p>
+            <w:pPr>
+              <w:pStyle w:val="Compact"/>
+            </w:pPr>
+            <w:r>
+              <w:rPr>
+                <w:rStyle w:val="VerbatimChar"/>
+              </w:rPr>
+              <w:t xml:space="preserve">prenatal_instructor</w:t>
+            </w:r>
+          </w:p>
+        </w:tc>
+        <w:tc>
+          <w:tcPr/>
+          <w:p>
+            <w:pPr>
+              <w:pStyle w:val="Compact"/>
+            </w:pPr>
+            <w:r>
+              <w:t xml:space="preserve">Lektorka predpôrodnej prípravy</w:t>
+            </w:r>
+          </w:p>
+        </w:tc>
+        <w:tc>
+          <w:tcPr/>
+          <w:p>
+            <w:pPr>
+              <w:pStyle w:val="Compact"/>
+            </w:pPr>
+            <w:r>
+              <w:t xml:space="preserve">Prenatal Preparation Instructor</w:t>
+            </w:r>
+          </w:p>
+        </w:tc>
+      </w:tr>
+      <w:tr>
+        <w:tc>
+          <w:tcPr/>
+          <w:p>
+            <w:pPr>
+              <w:pStyle w:val="Compact"/>
+            </w:pPr>
+            <w:r>
+              <w:rPr>
+                <w:rStyle w:val="VerbatimChar"/>
+              </w:rPr>
+              <w:t xml:space="preserve">doula</w:t>
+            </w:r>
+          </w:p>
+        </w:tc>
+        <w:tc>
+          <w:tcPr/>
+          <w:p>
+            <w:pPr>
+              <w:pStyle w:val="Compact"/>
+            </w:pPr>
+            <w:r>
+              <w:t xml:space="preserve">Dula</w:t>
+            </w:r>
+          </w:p>
+        </w:tc>
+        <w:tc>
+          <w:tcPr/>
+          <w:p>
+            <w:pPr>
+              <w:pStyle w:val="Compact"/>
+            </w:pPr>
+            <w:r>
+              <w:t xml:space="preserve">Doula</w:t>
+            </w:r>
+          </w:p>
+        </w:tc>
+      </w:tr>
+      <w:tr>
+        <w:tc>
+          <w:tcPr/>
+          <w:p>
+            <w:pPr>
+              <w:pStyle w:val="Compact"/>
+            </w:pPr>
+            <w:r>
+              <w:rPr>
+                <w:rStyle w:val="VerbatimChar"/>
+              </w:rPr>
+              <w:t xml:space="preserve">lactation_consultant</w:t>
+            </w:r>
+          </w:p>
+        </w:tc>
+        <w:tc>
+          <w:tcPr/>
+          <w:p>
+            <w:pPr>
+              <w:pStyle w:val="Compact"/>
+            </w:pPr>
+            <w:r>
+              <w:t xml:space="preserve">Laktačná poradkyňa</w:t>
+            </w:r>
+          </w:p>
+        </w:tc>
+        <w:tc>
+          <w:tcPr/>
+          <w:p>
+            <w:pPr>
+              <w:pStyle w:val="Compact"/>
+            </w:pPr>
+            <w:r>
+              <w:t xml:space="preserve">Lactation Consultant</w:t>
+            </w:r>
+          </w:p>
+        </w:tc>
+      </w:tr>
+    </w:tbl>
     <w:p>
       <w:r>
         <w:pict>
@@ -6381,9 +7008,10 @@
         </w:pict>
       </w:r>
     </w:p>
-    <w:bookmarkEnd w:id="56"/>
-    <w:bookmarkEnd w:id="57"/>
-    <w:bookmarkStart w:id="60" w:name="pipeline-stav-spolupráce-s-ambulanciou"/>
+    <w:bookmarkEnd w:id="61"/>
+    <w:bookmarkEnd w:id="62"/>
+    <w:bookmarkEnd w:id="63"/>
+    <w:bookmarkStart w:id="66" w:name="pipeline-stav-spolupráce-s-ambulanciou"/>
     <w:p>
       <w:pPr>
         <w:pStyle w:val="Heading2"/>
@@ -6392,7 +7020,7 @@
         <w:t xml:space="preserve">7. Pipeline — stav spolupráce s ambulanciou</w:t>
       </w:r>
     </w:p>
-    <w:bookmarkStart w:id="58" w:name="vizuálny-postup-spolupráce"/>
+    <w:bookmarkStart w:id="64" w:name="vizuálny-postup-spolupráce"/>
     <w:p>
       <w:pPr>
         <w:pStyle w:val="Heading3"/>
@@ -6494,7 +7122,7 @@
               <w:pStyle w:val="Compact"/>
             </w:pPr>
             <w:r>
-              <w:t xml:space="preserve">Bol nastavený zdroj leadu (ambulancia je v databáze a má priradený pôvod)</w:t>
+              <w:t xml:space="preserve">Bol nastavený zdroj leadu (ambulancia má priradený pôvod)</w:t>
             </w:r>
           </w:p>
         </w:tc>
@@ -6656,11 +7284,11 @@
         <w:pStyle w:val="BodyText"/>
       </w:pPr>
       <w:r>
-        <w:t xml:space="preserve">Kroky označené červenou farbou signalizujú odmietnutie v danej fáze — napr. lekár odmietol spoluprácu alebo odmietol podpísať zmluvu.</w:t>
-      </w:r>
-    </w:p>
-    <w:bookmarkEnd w:id="58"/>
-    <w:bookmarkStart w:id="59" w:name="odporúčaný-postup-práce-s-pipeline"/>
+        <w:t xml:space="preserve">Kroky označené červenou farbou signalizujú odmietnutie v danej fáze.</w:t>
+      </w:r>
+    </w:p>
+    <w:bookmarkEnd w:id="64"/>
+    <w:bookmarkStart w:id="65" w:name="odporúčaný-postup-práce-s-pipeline"/>
     <w:p>
       <w:pPr>
         <w:pStyle w:val="Heading3"/>
@@ -6674,7 +7302,7 @@
         <w:pStyle w:val="Compact"/>
         <w:numPr>
           <w:ilvl w:val="0"/>
-          <w:numId w:val="1007"/>
+          <w:numId w:val="1008"/>
         </w:numPr>
       </w:pPr>
       <w:r>
@@ -6699,22 +7327,6 @@
           <w:iCs/>
         </w:rPr>
         <w:t xml:space="preserve">Nekontaktovaný</w:t>
-      </w:r>
-      <w:r>
-        <w:t xml:space="preserve"> </w:t>
-      </w:r>
-      <w:r>
-        <w:t xml:space="preserve">alebo</w:t>
-      </w:r>
-      <w:r>
-        <w:t xml:space="preserve"> </w:t>
-      </w:r>
-      <w:r>
-        <w:rPr>
-          <w:i/>
-          <w:iCs/>
-        </w:rPr>
-        <w:t xml:space="preserve">Záujem o spoluprácu</w:t>
       </w:r>
     </w:p>
     <w:p>
@@ -6722,7 +7334,7 @@
         <w:pStyle w:val="Compact"/>
         <w:numPr>
           <w:ilvl w:val="0"/>
-          <w:numId w:val="1007"/>
+          <w:numId w:val="1008"/>
         </w:numPr>
       </w:pPr>
       <w:r>
@@ -6736,7 +7348,7 @@
         <w:t xml:space="preserve"> </w:t>
       </w:r>
       <w:r>
-        <w:t xml:space="preserve">— zaznamenajte výsledok (pole Výsledok posledného hovoru) a nastavte Dátum ďalšieho kontaktu</w:t>
+        <w:t xml:space="preserve">— zaznamenajte výsledok a nastavte Dátum ďalšieho kontaktu</w:t>
       </w:r>
     </w:p>
     <w:p>
@@ -6744,7 +7356,7 @@
         <w:pStyle w:val="Compact"/>
         <w:numPr>
           <w:ilvl w:val="0"/>
-          <w:numId w:val="1007"/>
+          <w:numId w:val="1008"/>
         </w:numPr>
       </w:pPr>
       <w:r>
@@ -6758,7 +7370,7 @@
         <w:t xml:space="preserve"> </w:t>
       </w:r>
       <w:r>
-        <w:t xml:space="preserve">— posúvajte pipeline vpred:</w:t>
+        <w:t xml:space="preserve">— posúvajte pipeline:</w:t>
       </w:r>
       <w:r>
         <w:t xml:space="preserve"> </w:t>
@@ -6792,7 +7404,7 @@
         <w:pStyle w:val="Compact"/>
         <w:numPr>
           <w:ilvl w:val="0"/>
-          <w:numId w:val="1007"/>
+          <w:numId w:val="1008"/>
         </w:numPr>
       </w:pPr>
       <w:r>
@@ -6814,7 +7426,7 @@
         <w:pStyle w:val="Compact"/>
         <w:numPr>
           <w:ilvl w:val="0"/>
-          <w:numId w:val="1007"/>
+          <w:numId w:val="1008"/>
         </w:numPr>
       </w:pPr>
       <w:r>
@@ -6854,9 +7466,9 @@
         </w:pict>
       </w:r>
     </w:p>
-    <w:bookmarkEnd w:id="59"/>
-    <w:bookmarkEnd w:id="60"/>
-    <w:bookmarkStart w:id="67" w:name="tipy-pre-každodennú-prácu"/>
+    <w:bookmarkEnd w:id="65"/>
+    <w:bookmarkEnd w:id="66"/>
+    <w:bookmarkStart w:id="73" w:name="tipy-pre-každodennú-prácu"/>
     <w:p>
       <w:pPr>
         <w:pStyle w:val="Heading2"/>
@@ -6865,7 +7477,7 @@
         <w:t xml:space="preserve">8. Tipy pre každodennú prácu</w:t>
       </w:r>
     </w:p>
-    <w:bookmarkStart w:id="61" w:name="rýchle-vyhľadávanie"/>
+    <w:bookmarkStart w:id="67" w:name="rýchle-vyhľadávanie"/>
     <w:p>
       <w:pPr>
         <w:pStyle w:val="Heading3"/>
@@ -6879,17 +7491,17 @@
         <w:pStyle w:val="FirstParagraph"/>
       </w:pPr>
       <w:r>
-        <w:t xml:space="preserve">V každom module je vyhľadávacie pole v hornej časti — hľadá podľa mena, mesta, PSČ aj kódov. Globálne vyhľadávanie (ikona lupy v navigácii) prehľadáva naraz nemocnice, ambulancie aj osoby.</w:t>
-      </w:r>
-    </w:p>
-    <w:bookmarkEnd w:id="61"/>
-    <w:bookmarkStart w:id="62" w:name="filtrovanie"/>
+        <w:t xml:space="preserve">V každom module je vyhľadávacie pole — hľadá podľa mena, mesta, PSČ aj kódov. Globálne vyhľadávanie (ikona lupy v navigácii) prehľadáva naraz nemocnice, ambulancie aj osoby.</w:t>
+      </w:r>
+    </w:p>
+    <w:bookmarkEnd w:id="67"/>
+    <w:bookmarkStart w:id="68" w:name="filtrovanie-a-presety"/>
     <w:p>
       <w:pPr>
         <w:pStyle w:val="Heading3"/>
       </w:pPr>
       <w:r>
-        <w:t xml:space="preserve">Filtrovanie</w:t>
+        <w:t xml:space="preserve">Filtrovanie a presety</w:t>
       </w:r>
     </w:p>
     <w:p>
@@ -6932,8 +7544,8 @@
         <w:t xml:space="preserve">pre opakované použitie.</w:t>
       </w:r>
     </w:p>
-    <w:bookmarkEnd w:id="62"/>
-    <w:bookmarkStart w:id="63" w:name="export"/>
+    <w:bookmarkEnd w:id="68"/>
+    <w:bookmarkStart w:id="69" w:name="export"/>
     <w:p>
       <w:pPr>
         <w:pStyle w:val="Heading3"/>
@@ -6947,7 +7559,7 @@
         <w:pStyle w:val="FirstParagraph"/>
       </w:pPr>
       <w:r>
-        <w:t xml:space="preserve">V zozname nemocníc, ambulancií aj osôb je tlačidlo</w:t>
+        <w:t xml:space="preserve">V každom zozname je tlačidlo</w:t>
       </w:r>
       <w:r>
         <w:t xml:space="preserve"> </w:t>
@@ -6966,8 +7578,8 @@
         <w:t xml:space="preserve">(ikona tabuľky) — exportuje aktuálne zobrazenú a filtrovanú množinu do súboru Excel/CSV.</w:t>
       </w:r>
     </w:p>
-    <w:bookmarkEnd w:id="63"/>
-    <w:bookmarkStart w:id="64" w:name="obohacovanie-z-webu"/>
+    <w:bookmarkEnd w:id="69"/>
+    <w:bookmarkStart w:id="70" w:name="obohacovanie-z-webu"/>
     <w:p>
       <w:pPr>
         <w:pStyle w:val="Heading3"/>
@@ -6981,7 +7593,7 @@
         <w:pStyle w:val="FirstParagraph"/>
       </w:pPr>
       <w:r>
-        <w:t xml:space="preserve">Pri ambulanciách je dostupná funkcia</w:t>
+        <w:t xml:space="preserve">Pre ambulancie je dostupná funkcia</w:t>
       </w:r>
       <w:r>
         <w:t xml:space="preserve"> </w:t>
@@ -6997,11 +7609,11 @@
         <w:t xml:space="preserve"> </w:t>
       </w:r>
       <w:r>
-        <w:t xml:space="preserve">— systém sa pokúsi automaticky dohľadať chýbajúce kontaktné údaje (telefón, e-mail, web) na základe mena a adresy ambulancie.</w:t>
-      </w:r>
-    </w:p>
-    <w:bookmarkEnd w:id="64"/>
-    <w:bookmarkStart w:id="65" w:name="gps-a-mapa"/>
+        <w:t xml:space="preserve">— systém automaticky dohľadá chýbajúce kontaktné údaje (telefón, e-mail, web) na základe mena a adresy ambulancie.</w:t>
+      </w:r>
+    </w:p>
+    <w:bookmarkEnd w:id="70"/>
+    <w:bookmarkStart w:id="71" w:name="gps-a-mapa"/>
     <w:p>
       <w:pPr>
         <w:pStyle w:val="Heading3"/>
@@ -7015,22 +7627,7 @@
         <w:pStyle w:val="FirstParagraph"/>
       </w:pPr>
       <w:r>
-        <w:t xml:space="preserve">Každá nemocnica, ambulancia aj adresa osoby môže mať GPS súradnice. Súradnice možno:</w:t>
-      </w:r>
-      <w:r>
-        <w:t xml:space="preserve"> </w:t>
-      </w:r>
-      <w:r>
-        <w:t xml:space="preserve">- Zadať ručne</w:t>
-      </w:r>
-      <w:r>
-        <w:t xml:space="preserve"> </w:t>
-      </w:r>
-      <w:r>
-        <w:t xml:space="preserve">- Získať z GPS zariadenia (tlačidlo</w:t>
-      </w:r>
-      <w:r>
-        <w:t xml:space="preserve"> </w:t>
+        <w:t xml:space="preserve">Súradnice možno zadať ručne, získať z GPS zariadenia (</w:t>
       </w:r>
       <w:r>
         <w:rPr>
@@ -7040,16 +7637,7 @@
         <w:t xml:space="preserve">Získať polohu</w:t>
       </w:r>
       <w:r>
-        <w:t xml:space="preserve">)</w:t>
-      </w:r>
-      <w:r>
-        <w:t xml:space="preserve"> </w:t>
-      </w:r>
-      <w:r>
-        <w:t xml:space="preserve">- Po zadaní zobraziť na mape (tlačidlo</w:t>
-      </w:r>
-      <w:r>
-        <w:t xml:space="preserve"> </w:t>
+        <w:t xml:space="preserve">) alebo po zadaní zobraziť na mape (</w:t>
       </w:r>
       <w:r>
         <w:rPr>
@@ -7059,11 +7647,11 @@
         <w:t xml:space="preserve">Zobraziť na mape</w:t>
       </w:r>
       <w:r>
-        <w:t xml:space="preserve">)</w:t>
-      </w:r>
-    </w:p>
-    <w:bookmarkEnd w:id="65"/>
-    <w:bookmarkStart w:id="66" w:name="viacjazyčné-prostredie"/>
+        <w:t xml:space="preserve">). Dostupné pre nemocnice, ambulancie aj adresy osôb.</w:t>
+      </w:r>
+    </w:p>
+    <w:bookmarkEnd w:id="71"/>
+    <w:bookmarkStart w:id="72" w:name="viacjazyčné-prostredie"/>
     <w:p>
       <w:pPr>
         <w:pStyle w:val="Heading3"/>
@@ -7077,7 +7665,7 @@
         <w:pStyle w:val="FirstParagraph"/>
       </w:pPr>
       <w:r>
-        <w:t xml:space="preserve">INDEXUS je plne lokalizovaný — slovenčina, čeština, angličtina, maďarčina, rumunčina, taliančina, nemčina. Jazyk rozhrania sa nastavuje v profile používateľa. Krajinský filter v navigácii umožňuje zobraziť len záznamy pre vybranú krajinu.</w:t>
+        <w:t xml:space="preserve">INDEXUS je plne lokalizovaný — slovenčina, čeština, angličtina, maďarčina, rumunčina, taliančina, nemčina. Jazyk sa nastavuje v profile používateľa. Krajinský filter v navigácii umožňuje zobraziť len záznamy pre vybranú krajinu.</w:t>
       </w:r>
     </w:p>
     <w:p>
@@ -7109,9 +7697,9 @@
         <w:t xml:space="preserve">Posledná aktualizácia: máj 2026</w:t>
       </w:r>
     </w:p>
-    <w:bookmarkEnd w:id="66"/>
-    <w:bookmarkEnd w:id="67"/>
-    <w:bookmarkEnd w:id="68"/>
+    <w:bookmarkEnd w:id="72"/>
+    <w:bookmarkEnd w:id="73"/>
+    <w:bookmarkEnd w:id="74"/>
     <w:sectPr>
       <w:footnotePr>
         <w:numRestart w:val="eachSect"/>
@@ -7477,34 +8065,7 @@
     </w:lvlOverride>
   </w:num>
   <w:num w:numId="1004">
-    <w:abstractNumId w:val="99411"/>
-    <w:lvlOverride w:ilvl="0">
-      <w:startOverride w:val="1"/>
-    </w:lvlOverride>
-    <w:lvlOverride w:ilvl="1">
-      <w:startOverride w:val="1"/>
-    </w:lvlOverride>
-    <w:lvlOverride w:ilvl="2">
-      <w:startOverride w:val="1"/>
-    </w:lvlOverride>
-    <w:lvlOverride w:ilvl="3">
-      <w:startOverride w:val="1"/>
-    </w:lvlOverride>
-    <w:lvlOverride w:ilvl="4">
-      <w:startOverride w:val="1"/>
-    </w:lvlOverride>
-    <w:lvlOverride w:ilvl="5">
-      <w:startOverride w:val="1"/>
-    </w:lvlOverride>
-    <w:lvlOverride w:ilvl="6">
-      <w:startOverride w:val="1"/>
-    </w:lvlOverride>
-    <w:lvlOverride w:ilvl="7">
-      <w:startOverride w:val="1"/>
-    </w:lvlOverride>
-    <w:lvlOverride w:ilvl="8">
-      <w:startOverride w:val="1"/>
-    </w:lvlOverride>
+    <w:abstractNumId w:val="991"/>
   </w:num>
   <w:num w:numId="1005">
     <w:abstractNumId w:val="99411"/>
@@ -7537,9 +8098,39 @@
     </w:lvlOverride>
   </w:num>
   <w:num w:numId="1006">
+    <w:abstractNumId w:val="99411"/>
+    <w:lvlOverride w:ilvl="0">
+      <w:startOverride w:val="1"/>
+    </w:lvlOverride>
+    <w:lvlOverride w:ilvl="1">
+      <w:startOverride w:val="1"/>
+    </w:lvlOverride>
+    <w:lvlOverride w:ilvl="2">
+      <w:startOverride w:val="1"/>
+    </w:lvlOverride>
+    <w:lvlOverride w:ilvl="3">
+      <w:startOverride w:val="1"/>
+    </w:lvlOverride>
+    <w:lvlOverride w:ilvl="4">
+      <w:startOverride w:val="1"/>
+    </w:lvlOverride>
+    <w:lvlOverride w:ilvl="5">
+      <w:startOverride w:val="1"/>
+    </w:lvlOverride>
+    <w:lvlOverride w:ilvl="6">
+      <w:startOverride w:val="1"/>
+    </w:lvlOverride>
+    <w:lvlOverride w:ilvl="7">
+      <w:startOverride w:val="1"/>
+    </w:lvlOverride>
+    <w:lvlOverride w:ilvl="8">
+      <w:startOverride w:val="1"/>
+    </w:lvlOverride>
+  </w:num>
+  <w:num w:numId="1007">
     <w:abstractNumId w:val="991"/>
   </w:num>
-  <w:num w:numId="1007">
+  <w:num w:numId="1008">
     <w:abstractNumId w:val="99411"/>
     <w:lvlOverride w:ilvl="0">
       <w:startOverride w:val="1"/>

</xml_diff>